<commit_message>
Add user login and admin user management
</commit_message>
<xml_diff>
--- a/Documents/КР-6__БИВТ-24-4__Кадыров_Артур_Рустамович__artlo.docx
+++ b/Documents/КР-6__БИВТ-24-4__Кадыров_Артур_Рустамович__artlo.docx
@@ -335,7 +335,7 @@
           <w:b w:val="0"/>
           <w:sz w:val="24"/>
         </w:rPr>
-        <w:t>Предметной областью курсовой работы является разработка персонального клиент-серверного веб-приложения магазина игрушек artlo. Приложение демонстрирует типовой сценарий работы небольшого интернет-магазина: пользователь открывает клиентскую часть в браузере, регистрирует профиль, просматривает каталог, фильтрует товары по категориям, добавляет игрушки в корзину, оформляет заказ и видит обновление остатков.</w:t>
+        <w:t>Предметной областью курсовой работы является разработка персонального клиент-серверного веб-приложения магазина игрушек artlo. Приложение демонстрирует типовой сценарий работы небольшого интернет-магазина: пользователь открывает клиентскую часть в браузере, регистрирует профиль с паролем, входит по email и паролю, просматривает каталог, фильтрует товары по категориям, добавляет игрушки в корзину, оформляет заказ и видит обновление остатков.</w:t>
       </w:r>
     </w:p>
     <w:p>
@@ -363,7 +363,7 @@
           <w:b w:val="0"/>
           <w:sz w:val="24"/>
         </w:rPr>
-        <w:t>Проблема предметной области состоит в необходимости централизованно получать и проверять данные, а также ограничивать действия пользователей по категориям доступа. В простом приложении без валидации пользователь может отправить пустое имя или некорректный email, из-за чего данные становятся непригодными для дальнейшей обработки. Без разделения доступа любой посетитель мог бы выполнять административные действия. Поэтому в приложении предусмотрены серверная проверка входных данных, обработка ошибок и клиентское управление доступом.</w:t>
+        <w:t>Проблема предметной области состоит в необходимости централизованно получать и проверять данные, а также ограничивать действия пользователей по категориям доступа. В простом приложении без валидации пользователь может отправить пустое имя, некорректный email или слишком короткий пароль. Без разделения доступа любой посетитель мог бы выполнять административные действия. Поэтому в приложении предусмотрены серверная проверка входных данных, обработка ошибок, вход пользователя и отдельный вход администратора.</w:t>
       </w:r>
     </w:p>
     <w:p>
@@ -462,7 +462,7 @@
           <w:b w:val="0"/>
           <w:sz w:val="24"/>
         </w:rPr>
-        <w:t>Дополнительно реализованы GET /toys для вывода каталога игрушек и POST /toys/checkout для оформления заказа. На клиентской стороне реализована корзина, которая сохраняется в LocalStorage. При оформлении заказа сервер уменьшает остатки выбранных товаров в памяти и возвращает обновленный каталог.</w:t>
+        <w:t>Дополнительно реализованы DELETE /users/:id для удаления пользователя администратором, POST /auth/login для входа пользователя или администратора, GET /toys для вывода каталога игрушек и POST /toys/checkout для оформления заказа. На клиентской стороне реализована корзина, которая сохраняется в LocalStorage. При оформлении заказа сервер уменьшает остатки выбранных товаров в памяти и возвращает обновленный каталог.</w:t>
       </w:r>
     </w:p>
     <w:p>
@@ -505,7 +505,7 @@
           <w:b w:val="0"/>
           <w:sz w:val="24"/>
         </w:rPr>
-        <w:t>Клиентская часть отвечает за отображение начальной страницы регистрации, витрины магазина, корзины, ввод данных, отправку fetch-запросов, сохранение профиля и корзины в LocalStorage. Серверная часть отвечает за маршрутизацию, валидацию данных, выполнение бизнес-логики, формирование JSON-ответов, обработку исключений, обновление остатков и логирование запросов.</w:t>
+        <w:t>Клиентская часть отвечает за отображение начальной страницы входа и регистрации, витрины магазина, корзины, ввод данных, отправку fetch-запросов, сохранение профиля и корзины в LocalStorage. Серверная часть отвечает за маршрутизацию, валидацию данных, выполнение бизнес-логики, формирование JSON-ответов, обработку исключений, проверку паролей, удаление пользователей, обновление остатков и логирование запросов.</w:t>
       </w:r>
     </w:p>
     <w:p>
@@ -870,7 +870,7 @@
           <w:b w:val="0"/>
           <w:sz w:val="24"/>
         </w:rPr>
-        <w:t>Сущность User включает поля id, name, email и age. Поле name хранит имя пользователя, email хранит адрес электронной почты, age хранит возраст и может отсутствовать. Перед сохранением email приводится к нижнему регистру, а name очищается от лишних пробелов по краям.</w:t>
+        <w:t>Сущность User включает поля id, name, email, passwordHash и age. Поле passwordHash используется только внутри сервера и не возвращается клиенту в GET /users. При регистрации пользователь вводит пароль, сервер хеширует его через bcryptjs и сохраняет только хеш. Перед сохранением email приводится к нижнему регистру, а name очищается от лишних пробелов по краям.</w:t>
       </w:r>
     </w:p>
     <w:p>
@@ -1373,7 +1373,7 @@
           <w:b w:val="0"/>
           <w:sz w:val="24"/>
         </w:rPr>
-        <w:t>UsersController реализует обязательные endpoint задания. Метод findAll обрабатывает GET /users и возвращает весь массив пользователей. Метод findOne обрабатывает GET /users/:id и передает id в сервис. Метод create обрабатывает POST /users, принимает DTO из тела запроса и создает пользователя.</w:t>
+        <w:t>UsersController реализует обязательные endpoint задания. Метод findAll обрабатывает GET /users и возвращает массив пользователей без passwordHash. Метод findOne обрабатывает GET /users/:id и передает id в сервис. Метод create обрабатывает POST /users, принимает DTO из тела запроса и создает пользователя. Дополнительно реализован DELETE /users/:id для удаления пользователей администратором через интерфейс.</w:t>
       </w:r>
     </w:p>
     <w:p>
@@ -1387,7 +1387,7 @@
           <w:b w:val="0"/>
           <w:sz w:val="24"/>
         </w:rPr>
-        <w:t>UsersService содержит прикладную логику работы с пользователями. Метод findAll возвращает массив, findOne ищет пользователя по id и выбрасывает NotFoundException при отсутствии записи, create проверяет уникальность email и выбрасывает ConflictException при повторе адреса. После проверки создается объект User с новым id.</w:t>
+        <w:t>UsersService содержит прикладную логику работы с пользователями. Метод findAll возвращает публичный массив, findOne ищет пользователя по id и выбрасывает NotFoundException при отсутствии записи, create проверяет уникальность email и выбрасывает ConflictException при повторе адреса. После проверки создается объект User с новым id и bcrypt-хешем пароля.</w:t>
       </w:r>
     </w:p>
     <w:p>
@@ -1401,7 +1401,7 @@
           <w:b w:val="0"/>
           <w:sz w:val="24"/>
         </w:rPr>
-        <w:t>CreateUserDto описывает входные данные POST /users. Для name используются IsString и IsNotEmpty. Для email используются IsEmail и IsNotEmpty. Для age используются IsOptional, Type, IsInt, Min и Max. Благодаря этому сервер отклоняет пустые обязательные поля, некорректный email, лишние поля и некорректный возраст.</w:t>
+        <w:t>CreateUserDto описывает входные данные POST /users. Для name используются IsString и IsNotEmpty. Для email используются IsEmail и IsNotEmpty. Для password используется MinLength(6). Для age используются IsOptional, Type, IsInt, Min и Max. Благодаря этому сервер отклоняет пустые обязательные поля, некорректный email, слишком короткий пароль, лишние поля и некорректный возраст.</w:t>
       </w:r>
     </w:p>
     <w:p>
@@ -1457,7 +1457,7 @@
           <w:b w:val="0"/>
           <w:sz w:val="24"/>
         </w:rPr>
-        <w:t>AuthService оставлен как дополнительная демонстрация безопасной работы с паролями: в нем используются bcrypt-хеши. Основной пользовательский сценарий в текущей версии начинается не с логина администратора, а с регистрации покупателя через POST /users.</w:t>
+        <w:t>AuthService выполняет вход пользователей и администратора. Для администратора используется демонстрационная учетная запись admin/admin123. Для обычного пользователя логином является email, а пароль сравнивается с bcrypt-хешем, который хранится в UsersService. В ответ клиент получает роль, token и публичные данные пользователя.</w:t>
       </w:r>
     </w:p>
     <w:p>
@@ -1881,7 +1881,7 @@
           <w:b w:val="0"/>
           <w:sz w:val="24"/>
         </w:rPr>
-        <w:t>Клиентская часть реализована на React и Vite. Главный компонент App.jsx содержит состояние текущего профиля, формы регистрации, списка пользователей, каталога игрушек, корзины, выбранной категории и сообщения об ошибке. Разметка написана на JSX, а стили вынесены в файл styles.css.</w:t>
+        <w:t>Клиентская часть реализована на React и Vite. Главный компонент App.jsx содержит состояние текущего профиля, формы входа, формы регистрации, списка пользователей, каталога игрушек, корзины, выбранной категории и сообщения об ошибке. Разметка написана на JSX, а стили вынесены в файл styles.css.</w:t>
       </w:r>
     </w:p>
     <w:p>
@@ -1895,7 +1895,7 @@
           <w:b w:val="0"/>
           <w:sz w:val="24"/>
         </w:rPr>
-        <w:t>Интерфейс начинается со страницы регистрации. Пользователь вводит имя, email и возраст, после чего frontend отправляет POST /users. Если сервер успешно создает пользователя, профиль сохраняется в LocalStorage и приложение переключается на страницу магазина.</w:t>
+        <w:t>Интерфейс начинается со стартовой страницы, где есть два режима: вход и регистрация. При регистрации пользователь вводит имя, email, пароль и возраст, после чего frontend отправляет POST /users. При входе пользователь вводит email и пароль, а администратор вводит admin и admin123.</w:t>
       </w:r>
     </w:p>
     <w:p>
@@ -1909,7 +1909,7 @@
           <w:b w:val="0"/>
           <w:sz w:val="24"/>
         </w:rPr>
-        <w:t>Страница магазина содержит заголовок artlo, название «Магазин игрушек», карточку профиля покупателя, статистику по товарам и корзине, фильтр категорий, карточки товаров с фотографиями и корзину с расчетом итоговой суммы.</w:t>
+        <w:t>Страница магазина содержит заголовок artlo, название «Магазин игрушек», карточку текущего пользователя, статистику по товарам и корзине, фильтр категорий, карточки товаров с фотографиями и корзину с расчетом итоговой суммы. Если выполнен вход администратора, в блоке пользователей появляются кнопки удаления.</w:t>
       </w:r>
     </w:p>
     <w:p>
@@ -1979,7 +1979,7 @@
           <w:b w:val="0"/>
           <w:sz w:val="24"/>
         </w:rPr>
-        <w:t>Для отчета рекомендуется приложить скриншоты: страницу регистрации, магазин artlo, карточки пяти товаров с фотографиями, фильтр категорий, добавление товара в корзину, оформление заказа с изменением остатка, ошибку валидации email, ответ GET /users, ответ GET /toys, ответ POST /toys/checkout и лог запросов backend в терминале.</w:t>
+        <w:t>Для отчета рекомендуется приложить скриншоты: страницу входа и регистрации, регистрацию пользователя с паролем, вход пользователя, вход администратора, удаление пользователя администратором, магазин artlo, карточки пяти товаров с фотографиями, фильтр категорий, добавление товара в корзину, оформление заказа с изменением остатка, ошибку валидации email, ответ GET /users, ответ GET /toys, ответ POST /toys/checkout и лог запросов backend в терминале.</w:t>
       </w:r>
     </w:p>
     <w:p>
@@ -2022,7 +2022,7 @@
           <w:b w:val="0"/>
           <w:sz w:val="24"/>
         </w:rPr>
-        <w:t>Серверная часть демонстрирует изученные возможности NestJS: модули, контроллеры, сервисы, провайдеры, декораторы, DTO, ValidationPipe, фильтр исключений и middleware логирования. Клиентская часть демонстрирует HTML/JSX, CSS, Fetch API, LocalStorage, регистрацию профиля, витрину товаров, корзину и изменение остатков после заказа.</w:t>
+        <w:t>Серверная часть демонстрирует изученные возможности NestJS: модули, контроллеры, сервисы, провайдеры, декораторы, DTO, ValidationPipe, фильтр исключений и middleware логирования. Клиентская часть демонстрирует HTML/JSX, CSS, Fetch API, LocalStorage, регистрацию профиля с паролем, вход пользователя, вход администратора, удаление пользователей, витрину товаров, корзину и изменение остатков после заказа.</w:t>
       </w:r>
     </w:p>
     <w:p>

</xml_diff>

<commit_message>
Update detailed coursework report
</commit_message>
<xml_diff>
--- a/Documents/КР-6__БИВТ-24-4__Кадыров_Артур_Рустамович__artlo.docx
+++ b/Documents/КР-6__БИВТ-24-4__Кадыров_Артур_Рустамович__artlo.docx
@@ -173,7 +173,7 @@
           <w:b/>
           <w:sz w:val="24"/>
         </w:rPr>
-        <w:t>«Разработка клиент-серверного приложения Toy Shelf для учета игрушек»</w:t>
+        <w:t>«Разработка клиент-серверного приложения магазина игрушек artlo»</w:t>
       </w:r>
     </w:p>
     <w:p/>
@@ -335,7 +335,7 @@
           <w:b w:val="0"/>
           <w:sz w:val="24"/>
         </w:rPr>
-        <w:t>Предметной областью курсовой работы является разработка персонального клиент-серверного веб-приложения магазина игрушек artlo. Приложение демонстрирует типовой сценарий работы небольшого интернет-магазина: пользователь открывает клиентскую часть в браузере, регистрирует профиль с паролем, входит по email и паролю, просматривает каталог, фильтрует товары по категориям, добавляет игрушки в корзину, оформляет заказ и видит обновление остатков.</w:t>
+        <w:t>Предметной областью курсовой работы является разработка персонального клиент-серверного веб-приложения магазина игрушек artlo. Приложение моделирует работу небольшой витрины игрушек: пользователь регистрируется, входит в систему, просматривает товары, добавляет их в корзину, оформляет заказ и видит изменение остатков.</w:t>
       </w:r>
     </w:p>
     <w:p>
@@ -349,7 +349,7 @@
           <w:b w:val="0"/>
           <w:sz w:val="24"/>
         </w:rPr>
-        <w:t>Тема «игрушка» выбрана как простая и наглядная предметная область. Игрушка в приложении выступает объектом каталога, который имеет название, категорию, цену, изображение и остаток на складе. Пользователь выступает субъектом системы и содержит идентификатор, имя, адрес электронной почты и необязательный возраст. Такое разделение позволяет показать и предметную часть интерфейса, и обязательную часть задания, связанную с API пользователей.</w:t>
+        <w:t>В рамках предметной области выделены две основные группы сущностей: пользователи и товары. Пользователь содержит данные профиля и применяется для демонстрации обязательного API /users. Товар содержит название, категорию, цену, рейтинг, описание, изображение и остаток. Корзина хранится на стороне клиента и связывает пользователя с выбранными товарами.</w:t>
       </w:r>
     </w:p>
     <w:p>
@@ -363,7 +363,7 @@
           <w:b w:val="0"/>
           <w:sz w:val="24"/>
         </w:rPr>
-        <w:t>Проблема предметной области состоит в необходимости централизованно получать и проверять данные, а также ограничивать действия пользователей по категориям доступа. В простом приложении без валидации пользователь может отправить пустое имя, некорректный email или слишком короткий пароль. Без разделения доступа любой посетитель мог бы выполнять административные действия. Поэтому в приложении предусмотрены серверная проверка входных данных, обработка ошибок, вход пользователя и отдельный вход администратора.</w:t>
+        <w:t>Практическая проблема, решаемая приложением, состоит в организации удобного доступа к каталогу игрушек и в проверке корректности вводимых данных. Без серверной валидации пользователь мог бы создать профиль с пустым именем, неверным email или слишком коротким паролем. Без разграничения доступа любой пользователь мог бы удалять чужие профили. Поэтому в приложении реализованы регистрация, вход, роль администратора, обработка ошибок и клиентская админ-панель.</w:t>
       </w:r>
     </w:p>
     <w:p>
@@ -377,7 +377,7 @@
           <w:b w:val="0"/>
           <w:sz w:val="24"/>
         </w:rPr>
-        <w:t>Приложение ориентировано на учебную демонстрацию возможностей курса: HTML и CSS применяются в клиентском интерфейсе, LocalStorage используется для сохранения демо-сессии, REST API реализует обмен между клиентом и сервером, а NestJS показывает работу контроллеров, сервисов, провайдеров, декораторов, DTO и фильтров исключений.</w:t>
+        <w:t>Тема выбрана так, чтобы наглядно показать изученные в курсе возможности: HTML/JSX-разметку, CSS-оформление, REST API, LocalStorage, работу с HTTP-запросами и ответами, создание контроллеров и сервисов, использование DTO, декораторов, провайдеров, валидации, логирования и обработки исключений.</w:t>
       </w:r>
     </w:p>
     <w:p>
@@ -406,7 +406,7 @@
           <w:b w:val="0"/>
           <w:sz w:val="24"/>
         </w:rPr>
-        <w:t>Цель работы — разработать персональное клиент-серверное приложение Toy Shelf, проверить его работоспособность и подготовить пояснительную записку по выполненной работе. Приложение должно демонстрировать основные изученные возможности: HTML, CSS, API, LocalStorage, Git, управление доступом по категориям клиентов, обработку HTTP-запросов и валидацию данных.</w:t>
+        <w:t>Цель работы — разработать и протестировать персональное клиент-серверное приложение artlo, оформить пояснительную записку по требованиям ГОСТ и подготовить исходный код к загрузке в LMS Moodle и GitHub-репозиторий.</w:t>
       </w:r>
     </w:p>
     <w:p>
@@ -420,7 +420,7 @@
           <w:b w:val="0"/>
           <w:sz w:val="24"/>
         </w:rPr>
-        <w:t>В серверной части необходимо реализовать REST API для работы с пользователями. Обязательные endpoint: GET /users — получение списка всех пользователей, GET /users/:id — получение пользователя по идентификатору, POST /users — создание нового пользователя. Каждый пользователь содержит поля id, name, email и age. Поля id, name и email являются обязательными, поле age является необязательным.</w:t>
+        <w:t>По заданию API должен предоставлять обязательные endpoint: GET /users для получения списка пользователей, GET /users/:id для получения пользователя по идентификатору и POST /users для создания нового пользователя. Пользователь должен содержать id, name, email и age. Все поля, кроме age, являются обязательными, email должен быть валидным адресом электронной почты.</w:t>
       </w:r>
     </w:p>
     <w:p>
@@ -434,7 +434,7 @@
           <w:b w:val="0"/>
           <w:sz w:val="24"/>
         </w:rPr>
-        <w:t>Поле email должно проходить проверку формата адреса электронной почты. Для этого в проекте используется библиотека class-validator. Входные данные проверяются через DTO и глобальный ValidationPipe, что позволяет отклонять некорректные запросы до попадания данных в сервисную логику.</w:t>
+        <w:t>Данные пользователей по индивидуальной постановке должны храниться в памяти приложения и не сохраняться между перезапусками. Поэтому в проекте используется in-memory хранение в сервисах NestJS. Это решение соответствует формулировке задания, хотя в общем PDF с требованиями к курсовым работам также описывается вариант с БД. В данной работе постоянная БД не используется именно из-за требования о хранении данных в памяти.</w:t>
       </w:r>
     </w:p>
     <w:p>
@@ -448,7 +448,7 @@
           <w:b w:val="0"/>
           <w:sz w:val="24"/>
         </w:rPr>
-        <w:t>По индивидуальной постановке задания данные пользователей должны храниться в памяти и не должны сохраняться между перезапусками приложения. Поэтому в проекте не используется постоянная база данных: массив пользователей хранится внутри UsersService. Это решение соответствует специальному требованию о временном хранении данных. В PDF с общими требованиями к курсовой работе приведены расширенные требования к БД; для данной версии задания они не применяются, поскольку противоречат условию о хранении данных в памяти.</w:t>
+        <w:t>Для расширения функциональности и демонстрации темы дополнительно реализованы: регистрация с паролем, вход пользователя по email и паролю, вход администратора, удаление пользователей администратором, получение каталога игрушек, оформление заказа и уменьшение остатков товаров после заказа.</w:t>
       </w:r>
     </w:p>
     <w:p>
@@ -462,7 +462,7 @@
           <w:b w:val="0"/>
           <w:sz w:val="24"/>
         </w:rPr>
-        <w:t>Дополнительно реализованы DELETE /users/:id для удаления пользователя администратором, POST /auth/login для входа пользователя или администратора, GET /toys для вывода каталога игрушек и POST /toys/checkout для оформления заказа. На клиентской стороне реализована корзина, которая сохраняется в LocalStorage. При оформлении заказа сервер уменьшает остатки выбранных товаров в памяти и возвращает обновленный каталог.</w:t>
+        <w:t>Итоговый проект должен демонстрировать HTML, CSS, Git, LocalStorage, API, управление доступом по категориям пользователей, использование библиотек для валидации данных, создание контроллеров и сервисов, декораторы и провайдеры NestJS, работу с HTTP-запросами и ответами, обработку ошибок и исключений.</w:t>
       </w:r>
     </w:p>
     <w:p>
@@ -491,7 +491,7 @@
           <w:b w:val="0"/>
           <w:sz w:val="24"/>
         </w:rPr>
-        <w:t>Toy Shelf построен по клиент-серверной архитектуре. Клиентская часть реализована на React и запускается через Vite. Серверная часть реализована на NestJS и запускается как отдельное HTTP-приложение. Клиент и сервер взаимодействуют по протоколу HTTP, а данные передаются в формате JSON.</w:t>
+        <w:t>Приложение построено по клиент-серверной архитектуре. Клиентская часть расположена в папке Source/frontend и реализована на React + Vite. Серверная часть расположена в папке Source/backend и реализована на NestJS. Клиент и сервер запускаются отдельно: сервер на http://localhost:3000, клиент на адресе Vite, обычно http://localhost:5173.</w:t>
       </w:r>
     </w:p>
     <w:p>
@@ -505,7 +505,7 @@
           <w:b w:val="0"/>
           <w:sz w:val="24"/>
         </w:rPr>
-        <w:t>Клиентская часть отвечает за отображение начальной страницы входа и регистрации, витрины магазина, корзины, ввод данных, отправку fetch-запросов, сохранение профиля и корзины в LocalStorage. Серверная часть отвечает за маршрутизацию, валидацию данных, выполнение бизнес-логики, формирование JSON-ответов, обработку исключений, проверку паролей, удаление пользователей, обновление остатков и логирование запросов.</w:t>
+        <w:t>React-клиент отвечает за интерфейс, регистрацию, вход, отображение товаров, корзину, админ-панель, хранение состояния в LocalStorage и отправку HTTP-запросов. NestJS-сервер отвечает за маршрутизацию запросов, валидацию DTO, работу сервисов, хранение данных в памяти, логирование, обработку исключений и возврат JSON-ответов.</w:t>
       </w:r>
     </w:p>
     <w:p>
@@ -519,7 +519,7 @@
           <w:b w:val="0"/>
           <w:sz w:val="24"/>
         </w:rPr>
-        <w:t>Архитектура сервера разделена на модули. UsersModule отвечает за пользователей, AuthModule оставлен как демонстрационный модуль авторизации, ToysModule отвечает за каталог игрушек и оформление заказа. Такое разделение упрощает сопровождение проекта: каждая предметная область имеет собственный контроллер и сервис.</w:t>
+        <w:t>Сервер разделен на модули. UsersModule отвечает за пользователей и обязательные endpoint /users. AuthModule отвечает за вход пользователя и администратора. ToysModule отвечает за каталог игрушек и оформление заказа. AppModule объединяет эти модули в одно приложение.</w:t>
       </w:r>
     </w:p>
     <w:p>
@@ -533,21 +533,7 @@
           <w:b w:val="0"/>
           <w:sz w:val="24"/>
         </w:rPr>
-        <w:t>Контроллеры принимают HTTP-запросы и извлекают из них параметры. Сервисы выполняют прикладную логику и хранят данные. DTO описывают структуру входных данных и правила проверки. Провайдеры NestJS позволяют внедрять сервисы в контроллеры через dependency injection.</w:t>
-      </w:r>
-    </w:p>
-    <w:p>
-      <w:pPr>
-        <w:spacing w:line="360" w:lineRule="auto" w:after="120"/>
-        <w:jc w:val="both"/>
-      </w:pPr>
-      <w:r>
-        <w:rPr>
-          <w:rFonts w:ascii="Times New Roman" w:hAnsi="Times New Roman" w:eastAsia="Times New Roman"/>
-          <w:b w:val="0"/>
-          <w:sz w:val="24"/>
-        </w:rPr>
-        <w:t>В приложении используется CORS, чтобы React-клиент мог обращаться к API NestJS во время локальной разработки. Сервер запускается на порту 3000, клиент Vite обычно запускается на порту 5173.</w:t>
+        <w:t>Логика разделена по слоям: контроллеры принимают HTTP-запросы, сервисы выполняют прикладную логику, DTO описывают входные данные, а фильтр исключений формирует единый формат ошибок. Такой подход соответствует архитектурным практикам NestJS и упрощает защиту проекта: по каждому endpoint можно показать контроллер, сервис и DTO.</w:t>
       </w:r>
     </w:p>
     <w:tbl>
@@ -615,9 +601,9 @@
               <w:rPr>
                 <w:rFonts w:ascii="Times New Roman" w:hAnsi="Times New Roman" w:eastAsia="Times New Roman"/>
                 <w:b w:val="0"/>
-                <w:sz w:val="22"/>
+                <w:sz w:val="20"/>
               </w:rPr>
-              <w:t>React-клиент</w:t>
+              <w:t>React + Vite</w:t>
             </w:r>
           </w:p>
         </w:tc>
@@ -634,9 +620,9 @@
               <w:rPr>
                 <w:rFonts w:ascii="Times New Roman" w:hAnsi="Times New Roman" w:eastAsia="Times New Roman"/>
                 <w:b w:val="0"/>
-                <w:sz w:val="22"/>
+                <w:sz w:val="20"/>
               </w:rPr>
-              <w:t>Отображение интерфейса, работа с LocalStorage, отправка HTTP-запросов</w:t>
+              <w:t>Клиентский интерфейс, регистрация, вход, каталог, корзина, админ-панель</w:t>
             </w:r>
           </w:p>
         </w:tc>
@@ -655,9 +641,9 @@
               <w:rPr>
                 <w:rFonts w:ascii="Times New Roman" w:hAnsi="Times New Roman" w:eastAsia="Times New Roman"/>
                 <w:b w:val="0"/>
-                <w:sz w:val="22"/>
+                <w:sz w:val="20"/>
               </w:rPr>
-              <w:t>NestJS-сервер</w:t>
+              <w:t>NestJS API</w:t>
             </w:r>
           </w:p>
         </w:tc>
@@ -674,9 +660,9 @@
               <w:rPr>
                 <w:rFonts w:ascii="Times New Roman" w:hAnsi="Times New Roman" w:eastAsia="Times New Roman"/>
                 <w:b w:val="0"/>
-                <w:sz w:val="22"/>
+                <w:sz w:val="20"/>
               </w:rPr>
-              <w:t>REST API, валидация, обработка ошибок и логирование</w:t>
+              <w:t>REST API, валидация, сервисы, обработка ошибок, логирование</w:t>
             </w:r>
           </w:p>
         </w:tc>
@@ -695,7 +681,7 @@
               <w:rPr>
                 <w:rFonts w:ascii="Times New Roman" w:hAnsi="Times New Roman" w:eastAsia="Times New Roman"/>
                 <w:b w:val="0"/>
-                <w:sz w:val="22"/>
+                <w:sz w:val="20"/>
               </w:rPr>
               <w:t>UsersModule</w:t>
             </w:r>
@@ -714,9 +700,9 @@
               <w:rPr>
                 <w:rFonts w:ascii="Times New Roman" w:hAnsi="Times New Roman" w:eastAsia="Times New Roman"/>
                 <w:b w:val="0"/>
-                <w:sz w:val="22"/>
+                <w:sz w:val="20"/>
               </w:rPr>
-              <w:t>Работа с пользователями</w:t>
+              <w:t>GET /users, GET /users/:id, POST /users, DELETE /users/:id</w:t>
             </w:r>
           </w:p>
         </w:tc>
@@ -735,7 +721,7 @@
               <w:rPr>
                 <w:rFonts w:ascii="Times New Roman" w:hAnsi="Times New Roman" w:eastAsia="Times New Roman"/>
                 <w:b w:val="0"/>
-                <w:sz w:val="22"/>
+                <w:sz w:val="20"/>
               </w:rPr>
               <w:t>AuthModule</w:t>
             </w:r>
@@ -754,9 +740,9 @@
               <w:rPr>
                 <w:rFonts w:ascii="Times New Roman" w:hAnsi="Times New Roman" w:eastAsia="Times New Roman"/>
                 <w:b w:val="0"/>
-                <w:sz w:val="22"/>
+                <w:sz w:val="20"/>
               </w:rPr>
-              <w:t>Демонстрационная авторизация и категории доступа</w:t>
+              <w:t>POST /auth/login для входа пользователя и администратора</w:t>
             </w:r>
           </w:p>
         </w:tc>
@@ -775,7 +761,7 @@
               <w:rPr>
                 <w:rFonts w:ascii="Times New Roman" w:hAnsi="Times New Roman" w:eastAsia="Times New Roman"/>
                 <w:b w:val="0"/>
-                <w:sz w:val="22"/>
+                <w:sz w:val="20"/>
               </w:rPr>
               <w:t>ToysModule</w:t>
             </w:r>
@@ -794,9 +780,49 @@
               <w:rPr>
                 <w:rFonts w:ascii="Times New Roman" w:hAnsi="Times New Roman" w:eastAsia="Times New Roman"/>
                 <w:b w:val="0"/>
-                <w:sz w:val="22"/>
+                <w:sz w:val="20"/>
               </w:rPr>
-              <w:t>Демонстрационный каталог игрушек</w:t>
+              <w:t>GET /toys и POST /toys/checkout для каталога и заказа</w:t>
+            </w:r>
+          </w:p>
+        </w:tc>
+      </w:tr>
+      <w:tr>
+        <w:tc>
+          <w:tcPr>
+            <w:tcW w:type="dxa" w:w="4844"/>
+            <w:vAlign w:val="center"/>
+          </w:tcPr>
+          <w:p>
+            <w:pPr>
+              <w:jc w:val="left"/>
+            </w:pPr>
+            <w:r>
+              <w:rPr>
+                <w:rFonts w:ascii="Times New Roman" w:hAnsi="Times New Roman" w:eastAsia="Times New Roman"/>
+                <w:b w:val="0"/>
+                <w:sz w:val="20"/>
+              </w:rPr>
+              <w:t>LocalStorage</w:t>
+            </w:r>
+          </w:p>
+        </w:tc>
+        <w:tc>
+          <w:tcPr>
+            <w:tcW w:type="dxa" w:w="4844"/>
+            <w:vAlign w:val="center"/>
+          </w:tcPr>
+          <w:p>
+            <w:pPr>
+              <w:jc w:val="left"/>
+            </w:pPr>
+            <w:r>
+              <w:rPr>
+                <w:rFonts w:ascii="Times New Roman" w:hAnsi="Times New Roman" w:eastAsia="Times New Roman"/>
+                <w:b w:val="0"/>
+                <w:sz w:val="20"/>
+              </w:rPr>
+              <w:t>Хранение сессии и корзины на стороне клиента</w:t>
             </w:r>
           </w:p>
         </w:tc>
@@ -813,7 +839,7 @@
           <w:b w:val="0"/>
           <w:sz w:val="24"/>
         </w:rPr>
-        <w:t>Таблица 1 — Компоненты архитектуры</w:t>
+        <w:t>Таблица 1 — 3. архитектуры</w:t>
       </w:r>
     </w:p>
     <w:p>
@@ -842,7 +868,7 @@
           <w:b w:val="0"/>
           <w:sz w:val="24"/>
         </w:rPr>
-        <w:t>В данной реализации постоянная база данных отсутствует, потому что индивидуальное задание требует хранить данные в памяти и не сохранять их между перезапусками приложения. Поэтому раздел описывает не физическую БД, а структуру in-memory данных, используемых серверной частью.</w:t>
+        <w:t>В работе используется in-memory структура данных, а не физическая база данных. Это связано с прямым требованием индивидуального задания: данные должны храниться в памяти и не должны сохраняться между перезапусками приложения. Поэтому раздел описывает структуру данных, размещенных в сервисах NestJS.</w:t>
       </w:r>
     </w:p>
     <w:p>
@@ -856,7 +882,7 @@
           <w:b w:val="0"/>
           <w:sz w:val="24"/>
         </w:rPr>
-        <w:t>Основная структура данных — User. Она используется обязательными endpoint /users и хранится в массиве внутри UsersService. При создании пользователя сервер самостоятельно генерирует id с помощью randomUUID. Клиент не передает id в POST-запросе, что предотвращает конфликт идентификаторов.</w:t>
+        <w:t>Основная структура User используется для обязательных endpoint /users. Внутри сервера пользователь содержит id, name, email, passwordHash и age. Клиенту возвращается публичная версия пользователя без passwordHash. Такой подход позволяет показать безопасную работу с паролями: пароль не сохраняется открытым текстом и не возвращается через API.</w:t>
       </w:r>
     </w:p>
     <w:p>
@@ -870,7 +896,7 @@
           <w:b w:val="0"/>
           <w:sz w:val="24"/>
         </w:rPr>
-        <w:t>Сущность User включает поля id, name, email, passwordHash и age. Поле passwordHash используется только внутри сервера и не возвращается клиенту в GET /users. При регистрации пользователь вводит пароль, сервер хеширует его через bcryptjs и сохраняет только хеш. Перед сохранением email приводится к нижнему регистру, а name очищается от лишних пробелов по краям.</w:t>
+        <w:t>Структура Toy используется для каталога магазина artlo. Она содержит id, title, category, price, available, stock, rating, description и image. В каталоге используется пять товаров с фотографиями: радиоуправляемая машина Subaru Drift 4WD, робот Vector, кукла Candy, пазл Planet Earth и плюшевый динозавр Rex.</w:t>
       </w:r>
     </w:p>
     <w:p>
@@ -884,21 +910,7 @@
           <w:b w:val="0"/>
           <w:sz w:val="24"/>
         </w:rPr>
-        <w:t>Дополнительная структура Toy используется для отображения темы приложения. Она содержит id, title, category, price, available, stock, rating, description и image. В каталоге используется пять товаров: радиоуправляемая машина Subaru Drift 4WD, робот Vector, кукла Candy, пазл Planet Earth и плюшевый динозавр Rex. Данные игрушек хранятся в памяти и служат для демонстрации карточек товаров, фильтра категорий, корзины и обновления остатков.</w:t>
-      </w:r>
-    </w:p>
-    <w:p>
-      <w:pPr>
-        <w:spacing w:line="360" w:lineRule="auto" w:after="120"/>
-        <w:jc w:val="both"/>
-      </w:pPr>
-      <w:r>
-        <w:rPr>
-          <w:rFonts w:ascii="Times New Roman" w:hAnsi="Times New Roman" w:eastAsia="Times New Roman"/>
-          <w:b w:val="0"/>
-          <w:sz w:val="24"/>
-        </w:rPr>
-        <w:t>При перезапуске backend-приложения все созданные во время работы пользователи и измененные остатки исчезают, а сервисы снова инициализируются начальными демонстрационными данными. Это поведение проверяется вручную: зарегистрировать пользователя, оформить заказ, убедиться в уменьшении остатка, перезапустить сервер и повторно открыть GET /users и GET /toys.</w:t>
+        <w:t>Корзина хранится в LocalStorage на стороне клиента под ключом toy-shelf-cart. При оформлении заказа клиент отправляет товары на сервер через POST /toys/checkout. Сервер проверяет наличие товара и достаточный остаток, после чего уменьшает stock в массиве toys. После перезапуска сервера остатки возвращаются к исходным значениям, так как хранение является временным.</w:t>
       </w:r>
     </w:p>
     <w:tbl>
@@ -909,15 +921,14 @@
         <w:tblLook w:firstColumn="1" w:firstRow="1" w:lastColumn="0" w:lastRow="0" w:noHBand="0" w:noVBand="1" w:val="04A0"/>
       </w:tblPr>
       <w:tblGrid>
-        <w:gridCol w:w="2422"/>
-        <w:gridCol w:w="2422"/>
-        <w:gridCol w:w="2422"/>
-        <w:gridCol w:w="2422"/>
+        <w:gridCol w:w="3230"/>
+        <w:gridCol w:w="3230"/>
+        <w:gridCol w:w="3230"/>
       </w:tblGrid>
       <w:tr>
         <w:tc>
           <w:tcPr>
-            <w:tcW w:type="dxa" w:w="2422"/>
+            <w:tcW w:type="dxa" w:w="3230"/>
             <w:vAlign w:val="center"/>
           </w:tcPr>
           <w:p>
@@ -930,13 +941,13 @@
                 <w:b/>
                 <w:sz w:val="22"/>
               </w:rPr>
-              <w:t>Поле</w:t>
+              <w:t>Сущность</w:t>
             </w:r>
           </w:p>
         </w:tc>
         <w:tc>
           <w:tcPr>
-            <w:tcW w:type="dxa" w:w="2422"/>
+            <w:tcW w:type="dxa" w:w="3230"/>
             <w:vAlign w:val="center"/>
           </w:tcPr>
           <w:p>
@@ -949,32 +960,13 @@
                 <w:b/>
                 <w:sz w:val="22"/>
               </w:rPr>
-              <w:t>Тип</w:t>
+              <w:t>Поля</w:t>
             </w:r>
           </w:p>
         </w:tc>
         <w:tc>
           <w:tcPr>
-            <w:tcW w:type="dxa" w:w="2422"/>
-            <w:vAlign w:val="center"/>
-          </w:tcPr>
-          <w:p>
-            <w:pPr>
-              <w:jc w:val="left"/>
-            </w:pPr>
-            <w:r>
-              <w:rPr>
-                <w:rFonts w:ascii="Times New Roman" w:hAnsi="Times New Roman" w:eastAsia="Times New Roman"/>
-                <w:b/>
-                <w:sz w:val="22"/>
-              </w:rPr>
-              <w:t>Обязательность</w:t>
-            </w:r>
-          </w:p>
-        </w:tc>
-        <w:tc>
-          <w:tcPr>
-            <w:tcW w:type="dxa" w:w="2422"/>
+            <w:tcW w:type="dxa" w:w="3230"/>
             <w:vAlign w:val="center"/>
           </w:tcPr>
           <w:p>
@@ -995,7 +987,7 @@
       <w:tr>
         <w:tc>
           <w:tcPr>
-            <w:tcW w:type="dxa" w:w="2422"/>
+            <w:tcW w:type="dxa" w:w="3230"/>
             <w:vAlign w:val="center"/>
           </w:tcPr>
           <w:p>
@@ -1006,15 +998,15 @@
               <w:rPr>
                 <w:rFonts w:ascii="Times New Roman" w:hAnsi="Times New Roman" w:eastAsia="Times New Roman"/>
                 <w:b w:val="0"/>
-                <w:sz w:val="22"/>
+                <w:sz w:val="20"/>
               </w:rPr>
-              <w:t>id</w:t>
+              <w:t>User</w:t>
             </w:r>
           </w:p>
         </w:tc>
         <w:tc>
           <w:tcPr>
-            <w:tcW w:type="dxa" w:w="2422"/>
+            <w:tcW w:type="dxa" w:w="3230"/>
             <w:vAlign w:val="center"/>
           </w:tcPr>
           <w:p>
@@ -1025,15 +1017,15 @@
               <w:rPr>
                 <w:rFonts w:ascii="Times New Roman" w:hAnsi="Times New Roman" w:eastAsia="Times New Roman"/>
                 <w:b w:val="0"/>
-                <w:sz w:val="22"/>
+                <w:sz w:val="20"/>
               </w:rPr>
-              <w:t>string</w:t>
+              <w:t>id, name, email, passwordHash, age</w:t>
             </w:r>
           </w:p>
         </w:tc>
         <w:tc>
           <w:tcPr>
-            <w:tcW w:type="dxa" w:w="2422"/>
+            <w:tcW w:type="dxa" w:w="3230"/>
             <w:vAlign w:val="center"/>
           </w:tcPr>
           <w:p>
@@ -1044,15 +1036,17 @@
               <w:rPr>
                 <w:rFonts w:ascii="Times New Roman" w:hAnsi="Times New Roman" w:eastAsia="Times New Roman"/>
                 <w:b w:val="0"/>
-                <w:sz w:val="22"/>
+                <w:sz w:val="20"/>
               </w:rPr>
-              <w:t>да</w:t>
+              <w:t>Профиль пользователя; passwordHash не возвращается клиенту</w:t>
             </w:r>
           </w:p>
         </w:tc>
+      </w:tr>
+      <w:tr>
         <w:tc>
           <w:tcPr>
-            <w:tcW w:type="dxa" w:w="2422"/>
+            <w:tcW w:type="dxa" w:w="3230"/>
             <w:vAlign w:val="center"/>
           </w:tcPr>
           <w:p>
@@ -1063,17 +1057,15 @@
               <w:rPr>
                 <w:rFonts w:ascii="Times New Roman" w:hAnsi="Times New Roman" w:eastAsia="Times New Roman"/>
                 <w:b w:val="0"/>
-                <w:sz w:val="22"/>
+                <w:sz w:val="20"/>
               </w:rPr>
-              <w:t>Уникальный идентификатор пользователя</w:t>
+              <w:t>Toy</w:t>
             </w:r>
           </w:p>
         </w:tc>
-      </w:tr>
-      <w:tr>
         <w:tc>
           <w:tcPr>
-            <w:tcW w:type="dxa" w:w="2422"/>
+            <w:tcW w:type="dxa" w:w="3230"/>
             <w:vAlign w:val="center"/>
           </w:tcPr>
           <w:p>
@@ -1084,15 +1076,15 @@
               <w:rPr>
                 <w:rFonts w:ascii="Times New Roman" w:hAnsi="Times New Roman" w:eastAsia="Times New Roman"/>
                 <w:b w:val="0"/>
-                <w:sz w:val="22"/>
+                <w:sz w:val="20"/>
               </w:rPr>
-              <w:t>name</w:t>
+              <w:t>id, title, category, price, available, stock, rating, description, image</w:t>
             </w:r>
           </w:p>
         </w:tc>
         <w:tc>
           <w:tcPr>
-            <w:tcW w:type="dxa" w:w="2422"/>
+            <w:tcW w:type="dxa" w:w="3230"/>
             <w:vAlign w:val="center"/>
           </w:tcPr>
           <w:p>
@@ -1103,15 +1095,17 @@
               <w:rPr>
                 <w:rFonts w:ascii="Times New Roman" w:hAnsi="Times New Roman" w:eastAsia="Times New Roman"/>
                 <w:b w:val="0"/>
-                <w:sz w:val="22"/>
+                <w:sz w:val="20"/>
               </w:rPr>
-              <w:t>string</w:t>
+              <w:t>Карточка товара каталога</w:t>
             </w:r>
           </w:p>
         </w:tc>
+      </w:tr>
+      <w:tr>
         <w:tc>
           <w:tcPr>
-            <w:tcW w:type="dxa" w:w="2422"/>
+            <w:tcW w:type="dxa" w:w="3230"/>
             <w:vAlign w:val="center"/>
           </w:tcPr>
           <w:p>
@@ -1122,15 +1116,15 @@
               <w:rPr>
                 <w:rFonts w:ascii="Times New Roman" w:hAnsi="Times New Roman" w:eastAsia="Times New Roman"/>
                 <w:b w:val="0"/>
-                <w:sz w:val="22"/>
+                <w:sz w:val="20"/>
               </w:rPr>
-              <w:t>да</w:t>
+              <w:t>Cart</w:t>
             </w:r>
           </w:p>
         </w:tc>
         <w:tc>
           <w:tcPr>
-            <w:tcW w:type="dxa" w:w="2422"/>
+            <w:tcW w:type="dxa" w:w="3230"/>
             <w:vAlign w:val="center"/>
           </w:tcPr>
           <w:p>
@@ -1141,17 +1135,15 @@
               <w:rPr>
                 <w:rFonts w:ascii="Times New Roman" w:hAnsi="Times New Roman" w:eastAsia="Times New Roman"/>
                 <w:b w:val="0"/>
-                <w:sz w:val="22"/>
+                <w:sz w:val="20"/>
               </w:rPr>
-              <w:t>Имя пользователя</w:t>
+              <w:t>toyId, quantity</w:t>
             </w:r>
           </w:p>
         </w:tc>
-      </w:tr>
-      <w:tr>
         <w:tc>
           <w:tcPr>
-            <w:tcW w:type="dxa" w:w="2422"/>
+            <w:tcW w:type="dxa" w:w="3230"/>
             <w:vAlign w:val="center"/>
           </w:tcPr>
           <w:p>
@@ -1162,144 +1154,9 @@
               <w:rPr>
                 <w:rFonts w:ascii="Times New Roman" w:hAnsi="Times New Roman" w:eastAsia="Times New Roman"/>
                 <w:b w:val="0"/>
-                <w:sz w:val="22"/>
+                <w:sz w:val="20"/>
               </w:rPr>
-              <w:t>email</w:t>
-            </w:r>
-          </w:p>
-        </w:tc>
-        <w:tc>
-          <w:tcPr>
-            <w:tcW w:type="dxa" w:w="2422"/>
-            <w:vAlign w:val="center"/>
-          </w:tcPr>
-          <w:p>
-            <w:pPr>
-              <w:jc w:val="left"/>
-            </w:pPr>
-            <w:r>
-              <w:rPr>
-                <w:rFonts w:ascii="Times New Roman" w:hAnsi="Times New Roman" w:eastAsia="Times New Roman"/>
-                <w:b w:val="0"/>
-                <w:sz w:val="22"/>
-              </w:rPr>
-              <w:t>string</w:t>
-            </w:r>
-          </w:p>
-        </w:tc>
-        <w:tc>
-          <w:tcPr>
-            <w:tcW w:type="dxa" w:w="2422"/>
-            <w:vAlign w:val="center"/>
-          </w:tcPr>
-          <w:p>
-            <w:pPr>
-              <w:jc w:val="left"/>
-            </w:pPr>
-            <w:r>
-              <w:rPr>
-                <w:rFonts w:ascii="Times New Roman" w:hAnsi="Times New Roman" w:eastAsia="Times New Roman"/>
-                <w:b w:val="0"/>
-                <w:sz w:val="22"/>
-              </w:rPr>
-              <w:t>да</w:t>
-            </w:r>
-          </w:p>
-        </w:tc>
-        <w:tc>
-          <w:tcPr>
-            <w:tcW w:type="dxa" w:w="2422"/>
-            <w:vAlign w:val="center"/>
-          </w:tcPr>
-          <w:p>
-            <w:pPr>
-              <w:jc w:val="left"/>
-            </w:pPr>
-            <w:r>
-              <w:rPr>
-                <w:rFonts w:ascii="Times New Roman" w:hAnsi="Times New Roman" w:eastAsia="Times New Roman"/>
-                <w:b w:val="0"/>
-                <w:sz w:val="22"/>
-              </w:rPr>
-              <w:t>Адрес электронной почты</w:t>
-            </w:r>
-          </w:p>
-        </w:tc>
-      </w:tr>
-      <w:tr>
-        <w:tc>
-          <w:tcPr>
-            <w:tcW w:type="dxa" w:w="2422"/>
-            <w:vAlign w:val="center"/>
-          </w:tcPr>
-          <w:p>
-            <w:pPr>
-              <w:jc w:val="left"/>
-            </w:pPr>
-            <w:r>
-              <w:rPr>
-                <w:rFonts w:ascii="Times New Roman" w:hAnsi="Times New Roman" w:eastAsia="Times New Roman"/>
-                <w:b w:val="0"/>
-                <w:sz w:val="22"/>
-              </w:rPr>
-              <w:t>age</w:t>
-            </w:r>
-          </w:p>
-        </w:tc>
-        <w:tc>
-          <w:tcPr>
-            <w:tcW w:type="dxa" w:w="2422"/>
-            <w:vAlign w:val="center"/>
-          </w:tcPr>
-          <w:p>
-            <w:pPr>
-              <w:jc w:val="left"/>
-            </w:pPr>
-            <w:r>
-              <w:rPr>
-                <w:rFonts w:ascii="Times New Roman" w:hAnsi="Times New Roman" w:eastAsia="Times New Roman"/>
-                <w:b w:val="0"/>
-                <w:sz w:val="22"/>
-              </w:rPr>
-              <w:t>number</w:t>
-            </w:r>
-          </w:p>
-        </w:tc>
-        <w:tc>
-          <w:tcPr>
-            <w:tcW w:type="dxa" w:w="2422"/>
-            <w:vAlign w:val="center"/>
-          </w:tcPr>
-          <w:p>
-            <w:pPr>
-              <w:jc w:val="left"/>
-            </w:pPr>
-            <w:r>
-              <w:rPr>
-                <w:rFonts w:ascii="Times New Roman" w:hAnsi="Times New Roman" w:eastAsia="Times New Roman"/>
-                <w:b w:val="0"/>
-                <w:sz w:val="22"/>
-              </w:rPr>
-              <w:t>нет</w:t>
-            </w:r>
-          </w:p>
-        </w:tc>
-        <w:tc>
-          <w:tcPr>
-            <w:tcW w:type="dxa" w:w="2422"/>
-            <w:vAlign w:val="center"/>
-          </w:tcPr>
-          <w:p>
-            <w:pPr>
-              <w:jc w:val="left"/>
-            </w:pPr>
-            <w:r>
-              <w:rPr>
-                <w:rFonts w:ascii="Times New Roman" w:hAnsi="Times New Roman" w:eastAsia="Times New Roman"/>
-                <w:b w:val="0"/>
-                <w:sz w:val="22"/>
-              </w:rPr>
-              <w:t>Возраст пользователя</w:t>
+              <w:t>Корзина клиента в LocalStorage</w:t>
             </w:r>
           </w:p>
         </w:tc>
@@ -1316,7 +1173,7 @@
           <w:b w:val="0"/>
           <w:sz w:val="24"/>
         </w:rPr>
-        <w:t>Таблица 2 — Структура сущности User</w:t>
+        <w:t>Таблица 2 — 4. структуры БД</w:t>
       </w:r>
     </w:p>
     <w:p>
@@ -1345,7 +1202,7 @@
           <w:b w:val="0"/>
           <w:sz w:val="24"/>
         </w:rPr>
-        <w:t>Серверная часть реализована на NestJS. Входной файл main.ts создает приложение через NestFactory, включает CORS, подключает глобальный ValidationPipe, регистрирует фильтр исключений HttpExceptionFilter и middleware логирования RequestLoggerMiddleware.</w:t>
+        <w:t>Серверная часть разработана на NestJS. В файле main.ts создается приложение через NestFactory, включается CORS, подключается глобальный ValidationPipe, регистрируется HttpExceptionFilter и RequestLoggerMiddleware. Сервер запускается на порту 3000.</w:t>
       </w:r>
     </w:p>
     <w:p>
@@ -1359,7 +1216,7 @@
           <w:b w:val="0"/>
           <w:sz w:val="24"/>
         </w:rPr>
-        <w:t>AppModule является корневым модулем приложения. Он подключает UsersModule, AuthModule и ToysModule. Модульная структура соответствует подходу NestJS: каждая область содержит собственный контроллер и сервис, а сервисы регистрируются как провайдеры.</w:t>
+        <w:t>UsersController реализует endpoint GET /users, GET /users/:id, POST /users и DELETE /users/:id. GET /users возвращает список публичных профилей. GET /users/:id ищет пользователя по id. POST /users создает нового пользователя после проверки DTO. DELETE /users/:id используется администратором для удаления пользователя.</w:t>
       </w:r>
     </w:p>
     <w:p>
@@ -1373,7 +1230,7 @@
           <w:b w:val="0"/>
           <w:sz w:val="24"/>
         </w:rPr>
-        <w:t>UsersController реализует обязательные endpoint задания. Метод findAll обрабатывает GET /users и возвращает массив пользователей без passwordHash. Метод findOne обрабатывает GET /users/:id и передает id в сервис. Метод create обрабатывает POST /users, принимает DTO из тела запроса и создает пользователя. Дополнительно реализован DELETE /users/:id для удаления пользователей администратором через интерфейс.</w:t>
+        <w:t>UsersService хранит массив пользователей в памяти. При создании пользователя сервис проверяет уникальность email, очищает имя от лишних пробелов, приводит email к нижнему регистру, генерирует id через randomUUID и сохраняет bcrypt-хеш пароля. Метод toPublicUser удаляет passwordHash из ответа API.</w:t>
       </w:r>
     </w:p>
     <w:p>
@@ -1387,7 +1244,7 @@
           <w:b w:val="0"/>
           <w:sz w:val="24"/>
         </w:rPr>
-        <w:t>UsersService содержит прикладную логику работы с пользователями. Метод findAll возвращает публичный массив, findOne ищет пользователя по id и выбрасывает NotFoundException при отсутствии записи, create проверяет уникальность email и выбрасывает ConflictException при повторе адреса. После проверки создается объект User с новым id и bcrypt-хешем пароля.</w:t>
+        <w:t>CreateUserDto задает правила валидации: name должен быть непустой строкой, email должен быть валидным адресом электронной почты, password должен иметь длину не меньше 6 символов, age является необязательным целым числом от 1 до 120. Для валидации используется class-validator, для преобразования age в число используется class-transformer.</w:t>
       </w:r>
     </w:p>
     <w:p>
@@ -1401,7 +1258,7 @@
           <w:b w:val="0"/>
           <w:sz w:val="24"/>
         </w:rPr>
-        <w:t>CreateUserDto описывает входные данные POST /users. Для name используются IsString и IsNotEmpty. Для email используются IsEmail и IsNotEmpty. Для password используется MinLength(6). Для age используются IsOptional, Type, IsInt, Min и Max. Благодаря этому сервер отклоняет пустые обязательные поля, некорректный email, слишком короткий пароль, лишние поля и некорректный возраст.</w:t>
+        <w:t>AuthController содержит POST /auth/login. AuthService проверяет вход администратора по логину admin и паролю admin123, а обычного пользователя — по email и паролю. Для проверки пароля используется bcrypt.compareSync. В ответ возвращаются token, role, login и публичные данные пользователя.</w:t>
       </w:r>
     </w:p>
     <w:p>
@@ -1415,7 +1272,7 @@
           <w:b w:val="0"/>
           <w:sz w:val="24"/>
         </w:rPr>
-        <w:t>HttpExceptionFilter приводит ошибки к единому виду JSON. Ответ содержит statusCode, timestamp и details. Такой формат удобен для клиента: frontend может получить сообщение ошибки и вывести его пользователю в интерфейсе.</w:t>
+        <w:t>ToysController содержит GET /toys и POST /toys/checkout. GET /toys возвращает каталог товаров. POST /toys/checkout принимает массив товаров из корзины, проверяет количество и остаток, уменьшает stock, обновляет available и возвращает сумму заказа вместе с обновленным каталогом.</w:t>
       </w:r>
     </w:p>
     <w:p>
@@ -1429,7 +1286,7 @@
           <w:b w:val="0"/>
           <w:sz w:val="24"/>
         </w:rPr>
-        <w:t>RequestLoggerMiddleware фиксирует метод запроса, URL, HTTP-статус и время выполнения в миллисекундах. Логирование помогает при защите показать, что сервер действительно получает запросы от клиента и корректно отвечает на них.</w:t>
+        <w:t>HttpExceptionFilter формирует единый формат ошибок JSON: statusCode, timestamp и details. Это удобно для frontend, потому что все ошибки можно обработать одинаково. RequestLoggerMiddleware фиксирует метод, URL, статус ответа и время выполнения запроса, что помогает при тестировании и защите.</w:t>
       </w:r>
     </w:p>
     <w:p>
@@ -1443,35 +1300,7 @@
           <w:b w:val="0"/>
           <w:sz w:val="24"/>
         </w:rPr>
-        <w:t>ToysController содержит GET /toys и POST /toys/checkout. Метод checkout принимает товары из корзины, проверяет существование каждого товара, проверяет положительное количество и достаточный остаток. После успешной проверки сервис уменьшает stock, обновляет available и возвращает сумму заказа вместе с обновленным каталогом.</w:t>
-      </w:r>
-    </w:p>
-    <w:p>
-      <w:pPr>
-        <w:spacing w:line="360" w:lineRule="auto" w:after="120"/>
-        <w:jc w:val="both"/>
-      </w:pPr>
-      <w:r>
-        <w:rPr>
-          <w:rFonts w:ascii="Times New Roman" w:hAnsi="Times New Roman" w:eastAsia="Times New Roman"/>
-          <w:b w:val="0"/>
-          <w:sz w:val="24"/>
-        </w:rPr>
-        <w:t>AuthService выполняет вход пользователей и администратора. Для администратора используется демонстрационная учетная запись admin/admin123. Для обычного пользователя логином является email, а пароль сравнивается с bcrypt-хешем, который хранится в UsersService. В ответ клиент получает роль, token и публичные данные пользователя.</w:t>
-      </w:r>
-    </w:p>
-    <w:p>
-      <w:pPr>
-        <w:spacing w:line="360" w:lineRule="auto" w:after="120"/>
-        <w:jc w:val="both"/>
-      </w:pPr>
-      <w:r>
-        <w:rPr>
-          <w:rFonts w:ascii="Times New Roman" w:hAnsi="Times New Roman" w:eastAsia="Times New Roman"/>
-          <w:b w:val="0"/>
-          <w:sz w:val="24"/>
-        </w:rPr>
-        <w:t>Проверка API выполняется через браузер, Postman, Thunder Client или PowerShell. Например, GET http://localhost:3000/users возвращает массив пользователей, POST http://localhost:3000/users создает профиль, GET http://localhost:3000/toys возвращает каталог, а POST http://localhost:3000/toys/checkout уменьшает остатки товаров после оформления заказа.</w:t>
+        <w:t>С точки зрения безопасности реализованы базовые учебные меры: пароль не хранится открытым текстом, passwordHash не отдается клиенту, email валидируется, лишние поля отбрасываются через ValidationPipe, а административная функция удаления пользователей показывается только после входа администратора. Для промышленного проекта можно дополнительно добавить JWT, guards и серверную проверку ролей на каждом защищенном endpoint.</w:t>
       </w:r>
     </w:p>
     <w:tbl>
@@ -1559,7 +1388,7 @@
               <w:rPr>
                 <w:rFonts w:ascii="Times New Roman" w:hAnsi="Times New Roman" w:eastAsia="Times New Roman"/>
                 <w:b w:val="0"/>
-                <w:sz w:val="22"/>
+                <w:sz w:val="20"/>
               </w:rPr>
               <w:t>/users</w:t>
             </w:r>
@@ -1578,7 +1407,7 @@
               <w:rPr>
                 <w:rFonts w:ascii="Times New Roman" w:hAnsi="Times New Roman" w:eastAsia="Times New Roman"/>
                 <w:b w:val="0"/>
-                <w:sz w:val="22"/>
+                <w:sz w:val="20"/>
               </w:rPr>
               <w:t>GET</w:t>
             </w:r>
@@ -1597,9 +1426,9 @@
               <w:rPr>
                 <w:rFonts w:ascii="Times New Roman" w:hAnsi="Times New Roman" w:eastAsia="Times New Roman"/>
                 <w:b w:val="0"/>
-                <w:sz w:val="22"/>
+                <w:sz w:val="20"/>
               </w:rPr>
-              <w:t>Получение списка всех пользователей</w:t>
+              <w:t>Получение списка пользователей</w:t>
             </w:r>
           </w:p>
         </w:tc>
@@ -1618,7 +1447,7 @@
               <w:rPr>
                 <w:rFonts w:ascii="Times New Roman" w:hAnsi="Times New Roman" w:eastAsia="Times New Roman"/>
                 <w:b w:val="0"/>
-                <w:sz w:val="22"/>
+                <w:sz w:val="20"/>
               </w:rPr>
               <w:t>/users/:id</w:t>
             </w:r>
@@ -1637,7 +1466,7 @@
               <w:rPr>
                 <w:rFonts w:ascii="Times New Roman" w:hAnsi="Times New Roman" w:eastAsia="Times New Roman"/>
                 <w:b w:val="0"/>
-                <w:sz w:val="22"/>
+                <w:sz w:val="20"/>
               </w:rPr>
               <w:t>GET</w:t>
             </w:r>
@@ -1656,7 +1485,7 @@
               <w:rPr>
                 <w:rFonts w:ascii="Times New Roman" w:hAnsi="Times New Roman" w:eastAsia="Times New Roman"/>
                 <w:b w:val="0"/>
-                <w:sz w:val="22"/>
+                <w:sz w:val="20"/>
               </w:rPr>
               <w:t>Получение пользователя по id</w:t>
             </w:r>
@@ -1677,7 +1506,7 @@
               <w:rPr>
                 <w:rFonts w:ascii="Times New Roman" w:hAnsi="Times New Roman" w:eastAsia="Times New Roman"/>
                 <w:b w:val="0"/>
-                <w:sz w:val="22"/>
+                <w:sz w:val="20"/>
               </w:rPr>
               <w:t>/users</w:t>
             </w:r>
@@ -1696,7 +1525,7 @@
               <w:rPr>
                 <w:rFonts w:ascii="Times New Roman" w:hAnsi="Times New Roman" w:eastAsia="Times New Roman"/>
                 <w:b w:val="0"/>
-                <w:sz w:val="22"/>
+                <w:sz w:val="20"/>
               </w:rPr>
               <w:t>POST</w:t>
             </w:r>
@@ -1715,9 +1544,9 @@
               <w:rPr>
                 <w:rFonts w:ascii="Times New Roman" w:hAnsi="Times New Roman" w:eastAsia="Times New Roman"/>
                 <w:b w:val="0"/>
-                <w:sz w:val="22"/>
+                <w:sz w:val="20"/>
               </w:rPr>
-              <w:t>Создание пользователя</w:t>
+              <w:t>Регистрация пользователя</w:t>
             </w:r>
           </w:p>
         </w:tc>
@@ -1736,7 +1565,66 @@
               <w:rPr>
                 <w:rFonts w:ascii="Times New Roman" w:hAnsi="Times New Roman" w:eastAsia="Times New Roman"/>
                 <w:b w:val="0"/>
-                <w:sz w:val="22"/>
+                <w:sz w:val="20"/>
+              </w:rPr>
+              <w:t>/users/:id</w:t>
+            </w:r>
+          </w:p>
+        </w:tc>
+        <w:tc>
+          <w:tcPr>
+            <w:tcW w:type="dxa" w:w="3230"/>
+            <w:vAlign w:val="center"/>
+          </w:tcPr>
+          <w:p>
+            <w:pPr>
+              <w:jc w:val="left"/>
+            </w:pPr>
+            <w:r>
+              <w:rPr>
+                <w:rFonts w:ascii="Times New Roman" w:hAnsi="Times New Roman" w:eastAsia="Times New Roman"/>
+                <w:b w:val="0"/>
+                <w:sz w:val="20"/>
+              </w:rPr>
+              <w:t>DELETE</w:t>
+            </w:r>
+          </w:p>
+        </w:tc>
+        <w:tc>
+          <w:tcPr>
+            <w:tcW w:type="dxa" w:w="3230"/>
+            <w:vAlign w:val="center"/>
+          </w:tcPr>
+          <w:p>
+            <w:pPr>
+              <w:jc w:val="left"/>
+            </w:pPr>
+            <w:r>
+              <w:rPr>
+                <w:rFonts w:ascii="Times New Roman" w:hAnsi="Times New Roman" w:eastAsia="Times New Roman"/>
+                <w:b w:val="0"/>
+                <w:sz w:val="20"/>
+              </w:rPr>
+              <w:t>Удаление пользователя администратором</w:t>
+            </w:r>
+          </w:p>
+        </w:tc>
+      </w:tr>
+      <w:tr>
+        <w:tc>
+          <w:tcPr>
+            <w:tcW w:type="dxa" w:w="3230"/>
+            <w:vAlign w:val="center"/>
+          </w:tcPr>
+          <w:p>
+            <w:pPr>
+              <w:jc w:val="left"/>
+            </w:pPr>
+            <w:r>
+              <w:rPr>
+                <w:rFonts w:ascii="Times New Roman" w:hAnsi="Times New Roman" w:eastAsia="Times New Roman"/>
+                <w:b w:val="0"/>
+                <w:sz w:val="20"/>
               </w:rPr>
               <w:t>/auth/login</w:t>
             </w:r>
@@ -1755,7 +1643,7 @@
               <w:rPr>
                 <w:rFonts w:ascii="Times New Roman" w:hAnsi="Times New Roman" w:eastAsia="Times New Roman"/>
                 <w:b w:val="0"/>
-                <w:sz w:val="22"/>
+                <w:sz w:val="20"/>
               </w:rPr>
               <w:t>POST</w:t>
             </w:r>
@@ -1774,9 +1662,9 @@
               <w:rPr>
                 <w:rFonts w:ascii="Times New Roman" w:hAnsi="Times New Roman" w:eastAsia="Times New Roman"/>
                 <w:b w:val="0"/>
-                <w:sz w:val="22"/>
+                <w:sz w:val="20"/>
               </w:rPr>
-              <w:t>Демонстрационная авторизация</w:t>
+              <w:t>Вход пользователя или администратора</w:t>
             </w:r>
           </w:p>
         </w:tc>
@@ -1795,7 +1683,7 @@
               <w:rPr>
                 <w:rFonts w:ascii="Times New Roman" w:hAnsi="Times New Roman" w:eastAsia="Times New Roman"/>
                 <w:b w:val="0"/>
-                <w:sz w:val="22"/>
+                <w:sz w:val="20"/>
               </w:rPr>
               <w:t>/toys</w:t>
             </w:r>
@@ -1814,7 +1702,7 @@
               <w:rPr>
                 <w:rFonts w:ascii="Times New Roman" w:hAnsi="Times New Roman" w:eastAsia="Times New Roman"/>
                 <w:b w:val="0"/>
-                <w:sz w:val="22"/>
+                <w:sz w:val="20"/>
               </w:rPr>
               <w:t>GET</w:t>
             </w:r>
@@ -1833,9 +1721,68 @@
               <w:rPr>
                 <w:rFonts w:ascii="Times New Roman" w:hAnsi="Times New Roman" w:eastAsia="Times New Roman"/>
                 <w:b w:val="0"/>
-                <w:sz w:val="22"/>
+                <w:sz w:val="20"/>
               </w:rPr>
-              <w:t>Получение каталога игрушек</w:t>
+              <w:t>Получение каталога товаров</w:t>
+            </w:r>
+          </w:p>
+        </w:tc>
+      </w:tr>
+      <w:tr>
+        <w:tc>
+          <w:tcPr>
+            <w:tcW w:type="dxa" w:w="3230"/>
+            <w:vAlign w:val="center"/>
+          </w:tcPr>
+          <w:p>
+            <w:pPr>
+              <w:jc w:val="left"/>
+            </w:pPr>
+            <w:r>
+              <w:rPr>
+                <w:rFonts w:ascii="Times New Roman" w:hAnsi="Times New Roman" w:eastAsia="Times New Roman"/>
+                <w:b w:val="0"/>
+                <w:sz w:val="20"/>
+              </w:rPr>
+              <w:t>/toys/checkout</w:t>
+            </w:r>
+          </w:p>
+        </w:tc>
+        <w:tc>
+          <w:tcPr>
+            <w:tcW w:type="dxa" w:w="3230"/>
+            <w:vAlign w:val="center"/>
+          </w:tcPr>
+          <w:p>
+            <w:pPr>
+              <w:jc w:val="left"/>
+            </w:pPr>
+            <w:r>
+              <w:rPr>
+                <w:rFonts w:ascii="Times New Roman" w:hAnsi="Times New Roman" w:eastAsia="Times New Roman"/>
+                <w:b w:val="0"/>
+                <w:sz w:val="20"/>
+              </w:rPr>
+              <w:t>POST</w:t>
+            </w:r>
+          </w:p>
+        </w:tc>
+        <w:tc>
+          <w:tcPr>
+            <w:tcW w:type="dxa" w:w="3230"/>
+            <w:vAlign w:val="center"/>
+          </w:tcPr>
+          <w:p>
+            <w:pPr>
+              <w:jc w:val="left"/>
+            </w:pPr>
+            <w:r>
+              <w:rPr>
+                <w:rFonts w:ascii="Times New Roman" w:hAnsi="Times New Roman" w:eastAsia="Times New Roman"/>
+                <w:b w:val="0"/>
+                <w:sz w:val="20"/>
+              </w:rPr>
+              <w:t>Оформление заказа и уменьшение остатков</w:t>
             </w:r>
           </w:p>
         </w:tc>
@@ -1852,7 +1799,7 @@
           <w:b w:val="0"/>
           <w:sz w:val="24"/>
         </w:rPr>
-        <w:t>Таблица 3 — Основные endpoint приложения</w:t>
+        <w:t>Таблица 3 — 5. серверной части</w:t>
       </w:r>
     </w:p>
     <w:p>
@@ -1881,7 +1828,7 @@
           <w:b w:val="0"/>
           <w:sz w:val="24"/>
         </w:rPr>
-        <w:t>Клиентская часть реализована на React и Vite. Главный компонент App.jsx содержит состояние текущего профиля, формы входа, формы регистрации, списка пользователей, каталога игрушек, корзины, выбранной категории и сообщения об ошибке. Разметка написана на JSX, а стили вынесены в файл styles.css.</w:t>
+        <w:t>Клиентская часть разработана на React + Vite. Основной файл App.jsx содержит состояние текущей сессии, формы входа, формы регистрации, списка пользователей, списка товаров, корзины, выбранной категории и сообщения об ошибке. API-запросы вынесены в api.js, работа с LocalStorage — в storage.js, оформление — в styles.css.</w:t>
       </w:r>
     </w:p>
     <w:p>
@@ -1895,7 +1842,7 @@
           <w:b w:val="0"/>
           <w:sz w:val="24"/>
         </w:rPr>
-        <w:t>Интерфейс начинается со стартовой страницы, где есть два режима: вход и регистрация. При регистрации пользователь вводит имя, email, пароль и возраст, после чего frontend отправляет POST /users. При входе пользователь вводит email и пароль, а администратор вводит admin и admin123.</w:t>
+        <w:t>Стартовая страница содержит два режима: вход и регистрация. В режиме регистрации пользователь вводит имя, email, пароль и возраст. После отправки формы выполняется POST /users. В режиме входа пользователь выбирает тип входа: пользователь или администратор. Пользователь входит по email и паролю, администратор — по admin/admin123.</w:t>
       </w:r>
     </w:p>
     <w:p>
@@ -1909,7 +1856,7 @@
           <w:b w:val="0"/>
           <w:sz w:val="24"/>
         </w:rPr>
-        <w:t>Страница магазина содержит заголовок artlo, название «Магазин игрушек», карточку текущего пользователя, статистику по товарам и корзине, фильтр категорий, карточки товаров с фотографиями и корзину с расчетом итоговой суммы. Если выполнен вход администратора, в блоке пользователей появляются кнопки удаления.</w:t>
+        <w:t>После входа открывается магазин artlo. В верхней части отображается бренд, название «Магазин игрушек» и карточка текущего пользователя. Ниже показана статистика: количество товаров, количество товаров в корзине и сумма заказа.</w:t>
       </w:r>
     </w:p>
     <w:p>
@@ -1923,7 +1870,7 @@
           <w:b w:val="0"/>
           <w:sz w:val="24"/>
         </w:rPr>
-        <w:t>Функции loadSession, saveSession и clearSession находятся в storage.js. Они работают с ключом toy-shelf-session. Для корзины используются loadCart, saveCart и clearCart с отдельным ключом toy-shelf-cart. LocalStorage выбран потому, что он изучается в рамках курса и позволяет показать хранение состояния на стороне клиента. При этом чувствительные данные, например реальные пароли или платежные сведения, в LocalStorage не сохраняются.</w:t>
+        <w:t>Каталог состоит из пяти карточек товаров с фотографиями, названием, категорией, рейтингом, описанием, ценой и остатком. Фильтр категорий позволяет показать только товары выбранной категории. Изображения товаров хранятся локально в Source/frontend/public/images, поэтому сайт не зависит от внешних картинок.</w:t>
       </w:r>
     </w:p>
     <w:p>
@@ -1937,7 +1884,7 @@
           <w:b w:val="0"/>
           <w:sz w:val="24"/>
         </w:rPr>
-        <w:t>Функция request из api.js инкапсулирует работу с Fetch API. Она отправляет запрос на сервер, разбирает JSON-ответ, проверяет HTTP-статус и преобразует ошибки в текстовое сообщение. Благодаря этому App.jsx не дублирует обработку ошибок для каждого запроса.</w:t>
+        <w:t>Корзина находится справа от каталога. Пользователь может добавлять товары, уменьшать и увеличивать количество, удалять позицию из корзины и оформить заказ. Корзина сохраняется в LocalStorage, поэтому выбранные товары не исчезают после обновления страницы. При оформлении заказа frontend отправляет POST /toys/checkout, очищает корзину и обновляет остатки товаров.</w:t>
       </w:r>
     </w:p>
     <w:p>
@@ -1951,7 +1898,7 @@
           <w:b w:val="0"/>
           <w:sz w:val="24"/>
         </w:rPr>
-        <w:t>Оформление заказа выполняется из корзины. Клиент отправляет POST /toys/checkout со списком товаров и количеством. После успешного ответа корзина очищается, а каталог обновляется: если товара было 8 и пользователь заказал 1, на карточке остается 7. Так демонстрируется изменение состояния серверной in-memory модели.</w:t>
+        <w:t>Администратор после входа видит блок «Управление пользователями». В нем выводится список пользователей и кнопки удаления. При нажатии на кнопку выполняется DELETE /users/:id, после чего список обновляется через GET /users.</w:t>
       </w:r>
     </w:p>
     <w:p>
@@ -1965,13 +1912,53 @@
           <w:b w:val="0"/>
           <w:sz w:val="24"/>
         </w:rPr>
-        <w:t>CSS-файл задает визуальное оформление приложения: страницу регистрации, сетку каталога, карточки товаров, изображения, фильтр категорий, корзину, кнопки и адаптивное поведение. На экранах небольшой ширины сетка перестраивается в одну колонку.</w:t>
+        <w:t>CSS-оформление сделано так, чтобы сайт не выглядел стандартной белой страницей: используется цветной фон, темная брендовая стартовая панель, акцентные кнопки, карточки с тенями, цветовые бейджи остатков и адаптивная сетка. Фотография куклы отображается через object-fit: contain, поэтому вертикальное изображение не обрезается.</w:t>
       </w:r>
     </w:p>
+    <w:tbl>
+      <w:tblPr>
+        <w:tblStyle w:val="TableGrid"/>
+        <w:tblW w:type="auto" w:w="0"/>
+        <w:jc w:val="center"/>
+        <w:tblLook w:firstColumn="1" w:firstRow="1" w:lastColumn="0" w:lastRow="0" w:noHBand="0" w:noVBand="1" w:val="04A0"/>
+      </w:tblPr>
+      <w:tblGrid>
+        <w:gridCol w:w="9689"/>
+      </w:tblGrid>
+      <w:tr>
+        <w:tc>
+          <w:tcPr>
+            <w:tcW w:type="dxa" w:w="9689"/>
+            <w:vAlign w:val="center"/>
+          </w:tcPr>
+          <w:p>
+            <w:pPr>
+              <w:jc w:val="center"/>
+            </w:pPr>
+            <w:r>
+              <w:rPr>
+                <w:rFonts w:ascii="Times New Roman" w:hAnsi="Times New Roman" w:eastAsia="Times New Roman"/>
+                <w:b/>
+                <w:sz w:val="24"/>
+              </w:rPr>
+              <w:t>Место для скриншота</w:t>
+            </w:r>
+          </w:p>
+          <w:p/>
+          <w:p/>
+          <w:p/>
+          <w:p/>
+          <w:p/>
+          <w:p/>
+          <w:p/>
+          <w:p/>
+        </w:tc>
+      </w:tr>
+    </w:tbl>
     <w:p>
       <w:pPr>
         <w:spacing w:line="360" w:lineRule="auto" w:after="120"/>
-        <w:jc w:val="both"/>
+        <w:jc w:val="center"/>
       </w:pPr>
       <w:r>
         <w:rPr>
@@ -1979,7 +1966,493 @@
           <w:b w:val="0"/>
           <w:sz w:val="24"/>
         </w:rPr>
-        <w:t>Для отчета рекомендуется приложить скриншоты: страницу входа и регистрации, регистрацию пользователя с паролем, вход пользователя, вход администратора, удаление пользователя администратором, магазин artlo, карточки пяти товаров с фотографиями, фильтр категорий, добавление товара в корзину, оформление заказа с изменением остатка, ошибку валидации email, ответ GET /users, ответ GET /toys, ответ POST /toys/checkout и лог запросов backend в терминале.</w:t>
+        <w:t>Рисунок 1 — Стартовая страница входа и регистрации</w:t>
+      </w:r>
+    </w:p>
+    <w:tbl>
+      <w:tblPr>
+        <w:tblStyle w:val="TableGrid"/>
+        <w:tblW w:type="auto" w:w="0"/>
+        <w:jc w:val="center"/>
+        <w:tblLook w:firstColumn="1" w:firstRow="1" w:lastColumn="0" w:lastRow="0" w:noHBand="0" w:noVBand="1" w:val="04A0"/>
+      </w:tblPr>
+      <w:tblGrid>
+        <w:gridCol w:w="9689"/>
+      </w:tblGrid>
+      <w:tr>
+        <w:tc>
+          <w:tcPr>
+            <w:tcW w:type="dxa" w:w="9689"/>
+            <w:vAlign w:val="center"/>
+          </w:tcPr>
+          <w:p>
+            <w:pPr>
+              <w:jc w:val="center"/>
+            </w:pPr>
+            <w:r>
+              <w:rPr>
+                <w:rFonts w:ascii="Times New Roman" w:hAnsi="Times New Roman" w:eastAsia="Times New Roman"/>
+                <w:b/>
+                <w:sz w:val="24"/>
+              </w:rPr>
+              <w:t>Место для скриншота</w:t>
+            </w:r>
+          </w:p>
+          <w:p/>
+          <w:p/>
+          <w:p/>
+          <w:p/>
+          <w:p/>
+          <w:p/>
+          <w:p/>
+          <w:p/>
+        </w:tc>
+      </w:tr>
+    </w:tbl>
+    <w:p>
+      <w:pPr>
+        <w:spacing w:line="360" w:lineRule="auto" w:after="120"/>
+        <w:jc w:val="center"/>
+      </w:pPr>
+      <w:r>
+        <w:rPr>
+          <w:rFonts w:ascii="Times New Roman" w:hAnsi="Times New Roman" w:eastAsia="Times New Roman"/>
+          <w:b w:val="0"/>
+          <w:sz w:val="24"/>
+        </w:rPr>
+        <w:t>Рисунок 2 — Регистрация пользователя с паролем</w:t>
+      </w:r>
+    </w:p>
+    <w:tbl>
+      <w:tblPr>
+        <w:tblStyle w:val="TableGrid"/>
+        <w:tblW w:type="auto" w:w="0"/>
+        <w:jc w:val="center"/>
+        <w:tblLook w:firstColumn="1" w:firstRow="1" w:lastColumn="0" w:lastRow="0" w:noHBand="0" w:noVBand="1" w:val="04A0"/>
+      </w:tblPr>
+      <w:tblGrid>
+        <w:gridCol w:w="9689"/>
+      </w:tblGrid>
+      <w:tr>
+        <w:tc>
+          <w:tcPr>
+            <w:tcW w:type="dxa" w:w="9689"/>
+            <w:vAlign w:val="center"/>
+          </w:tcPr>
+          <w:p>
+            <w:pPr>
+              <w:jc w:val="center"/>
+            </w:pPr>
+            <w:r>
+              <w:rPr>
+                <w:rFonts w:ascii="Times New Roman" w:hAnsi="Times New Roman" w:eastAsia="Times New Roman"/>
+                <w:b/>
+                <w:sz w:val="24"/>
+              </w:rPr>
+              <w:t>Место для скриншота</w:t>
+            </w:r>
+          </w:p>
+          <w:p/>
+          <w:p/>
+          <w:p/>
+          <w:p/>
+          <w:p/>
+          <w:p/>
+          <w:p/>
+          <w:p/>
+        </w:tc>
+      </w:tr>
+    </w:tbl>
+    <w:p>
+      <w:pPr>
+        <w:spacing w:line="360" w:lineRule="auto" w:after="120"/>
+        <w:jc w:val="center"/>
+      </w:pPr>
+      <w:r>
+        <w:rPr>
+          <w:rFonts w:ascii="Times New Roman" w:hAnsi="Times New Roman" w:eastAsia="Times New Roman"/>
+          <w:b w:val="0"/>
+          <w:sz w:val="24"/>
+        </w:rPr>
+        <w:t>Рисунок 3 — Вход администратора</w:t>
+      </w:r>
+    </w:p>
+    <w:tbl>
+      <w:tblPr>
+        <w:tblStyle w:val="TableGrid"/>
+        <w:tblW w:type="auto" w:w="0"/>
+        <w:jc w:val="center"/>
+        <w:tblLook w:firstColumn="1" w:firstRow="1" w:lastColumn="0" w:lastRow="0" w:noHBand="0" w:noVBand="1" w:val="04A0"/>
+      </w:tblPr>
+      <w:tblGrid>
+        <w:gridCol w:w="9689"/>
+      </w:tblGrid>
+      <w:tr>
+        <w:tc>
+          <w:tcPr>
+            <w:tcW w:type="dxa" w:w="9689"/>
+            <w:vAlign w:val="center"/>
+          </w:tcPr>
+          <w:p>
+            <w:pPr>
+              <w:jc w:val="center"/>
+            </w:pPr>
+            <w:r>
+              <w:rPr>
+                <w:rFonts w:ascii="Times New Roman" w:hAnsi="Times New Roman" w:eastAsia="Times New Roman"/>
+                <w:b/>
+                <w:sz w:val="24"/>
+              </w:rPr>
+              <w:t>Место для скриншота</w:t>
+            </w:r>
+          </w:p>
+          <w:p/>
+          <w:p/>
+          <w:p/>
+          <w:p/>
+          <w:p/>
+          <w:p/>
+          <w:p/>
+          <w:p/>
+        </w:tc>
+      </w:tr>
+    </w:tbl>
+    <w:p>
+      <w:pPr>
+        <w:spacing w:line="360" w:lineRule="auto" w:after="120"/>
+        <w:jc w:val="center"/>
+      </w:pPr>
+      <w:r>
+        <w:rPr>
+          <w:rFonts w:ascii="Times New Roman" w:hAnsi="Times New Roman" w:eastAsia="Times New Roman"/>
+          <w:b w:val="0"/>
+          <w:sz w:val="24"/>
+        </w:rPr>
+        <w:t>Рисунок 4 — Главная страница магазина artlo</w:t>
+      </w:r>
+    </w:p>
+    <w:tbl>
+      <w:tblPr>
+        <w:tblStyle w:val="TableGrid"/>
+        <w:tblW w:type="auto" w:w="0"/>
+        <w:jc w:val="center"/>
+        <w:tblLook w:firstColumn="1" w:firstRow="1" w:lastColumn="0" w:lastRow="0" w:noHBand="0" w:noVBand="1" w:val="04A0"/>
+      </w:tblPr>
+      <w:tblGrid>
+        <w:gridCol w:w="9689"/>
+      </w:tblGrid>
+      <w:tr>
+        <w:tc>
+          <w:tcPr>
+            <w:tcW w:type="dxa" w:w="9689"/>
+            <w:vAlign w:val="center"/>
+          </w:tcPr>
+          <w:p>
+            <w:pPr>
+              <w:jc w:val="center"/>
+            </w:pPr>
+            <w:r>
+              <w:rPr>
+                <w:rFonts w:ascii="Times New Roman" w:hAnsi="Times New Roman" w:eastAsia="Times New Roman"/>
+                <w:b/>
+                <w:sz w:val="24"/>
+              </w:rPr>
+              <w:t>Место для скриншота</w:t>
+            </w:r>
+          </w:p>
+          <w:p/>
+          <w:p/>
+          <w:p/>
+          <w:p/>
+          <w:p/>
+          <w:p/>
+          <w:p/>
+          <w:p/>
+        </w:tc>
+      </w:tr>
+    </w:tbl>
+    <w:p>
+      <w:pPr>
+        <w:spacing w:line="360" w:lineRule="auto" w:after="120"/>
+        <w:jc w:val="center"/>
+      </w:pPr>
+      <w:r>
+        <w:rPr>
+          <w:rFonts w:ascii="Times New Roman" w:hAnsi="Times New Roman" w:eastAsia="Times New Roman"/>
+          <w:b w:val="0"/>
+          <w:sz w:val="24"/>
+        </w:rPr>
+        <w:t>Рисунок 5 — Каталог товаров с фотографиями</w:t>
+      </w:r>
+    </w:p>
+    <w:tbl>
+      <w:tblPr>
+        <w:tblStyle w:val="TableGrid"/>
+        <w:tblW w:type="auto" w:w="0"/>
+        <w:jc w:val="center"/>
+        <w:tblLook w:firstColumn="1" w:firstRow="1" w:lastColumn="0" w:lastRow="0" w:noHBand="0" w:noVBand="1" w:val="04A0"/>
+      </w:tblPr>
+      <w:tblGrid>
+        <w:gridCol w:w="9689"/>
+      </w:tblGrid>
+      <w:tr>
+        <w:tc>
+          <w:tcPr>
+            <w:tcW w:type="dxa" w:w="9689"/>
+            <w:vAlign w:val="center"/>
+          </w:tcPr>
+          <w:p>
+            <w:pPr>
+              <w:jc w:val="center"/>
+            </w:pPr>
+            <w:r>
+              <w:rPr>
+                <w:rFonts w:ascii="Times New Roman" w:hAnsi="Times New Roman" w:eastAsia="Times New Roman"/>
+                <w:b/>
+                <w:sz w:val="24"/>
+              </w:rPr>
+              <w:t>Место для скриншота</w:t>
+            </w:r>
+          </w:p>
+          <w:p/>
+          <w:p/>
+          <w:p/>
+          <w:p/>
+          <w:p/>
+          <w:p/>
+          <w:p/>
+          <w:p/>
+        </w:tc>
+      </w:tr>
+    </w:tbl>
+    <w:p>
+      <w:pPr>
+        <w:spacing w:line="360" w:lineRule="auto" w:after="120"/>
+        <w:jc w:val="center"/>
+      </w:pPr>
+      <w:r>
+        <w:rPr>
+          <w:rFonts w:ascii="Times New Roman" w:hAnsi="Times New Roman" w:eastAsia="Times New Roman"/>
+          <w:b w:val="0"/>
+          <w:sz w:val="24"/>
+        </w:rPr>
+        <w:t>Рисунок 6 — Корзина и оформление заказа</w:t>
+      </w:r>
+    </w:p>
+    <w:tbl>
+      <w:tblPr>
+        <w:tblStyle w:val="TableGrid"/>
+        <w:tblW w:type="auto" w:w="0"/>
+        <w:jc w:val="center"/>
+        <w:tblLook w:firstColumn="1" w:firstRow="1" w:lastColumn="0" w:lastRow="0" w:noHBand="0" w:noVBand="1" w:val="04A0"/>
+      </w:tblPr>
+      <w:tblGrid>
+        <w:gridCol w:w="9689"/>
+      </w:tblGrid>
+      <w:tr>
+        <w:tc>
+          <w:tcPr>
+            <w:tcW w:type="dxa" w:w="9689"/>
+            <w:vAlign w:val="center"/>
+          </w:tcPr>
+          <w:p>
+            <w:pPr>
+              <w:jc w:val="center"/>
+            </w:pPr>
+            <w:r>
+              <w:rPr>
+                <w:rFonts w:ascii="Times New Roman" w:hAnsi="Times New Roman" w:eastAsia="Times New Roman"/>
+                <w:b/>
+                <w:sz w:val="24"/>
+              </w:rPr>
+              <w:t>Место для скриншота</w:t>
+            </w:r>
+          </w:p>
+          <w:p/>
+          <w:p/>
+          <w:p/>
+          <w:p/>
+          <w:p/>
+          <w:p/>
+          <w:p/>
+          <w:p/>
+        </w:tc>
+      </w:tr>
+    </w:tbl>
+    <w:p>
+      <w:pPr>
+        <w:spacing w:line="360" w:lineRule="auto" w:after="120"/>
+        <w:jc w:val="center"/>
+      </w:pPr>
+      <w:r>
+        <w:rPr>
+          <w:rFonts w:ascii="Times New Roman" w:hAnsi="Times New Roman" w:eastAsia="Times New Roman"/>
+          <w:b w:val="0"/>
+          <w:sz w:val="24"/>
+        </w:rPr>
+        <w:t>Рисунок 7 — Изменение остатка товара после заказа</w:t>
+      </w:r>
+    </w:p>
+    <w:tbl>
+      <w:tblPr>
+        <w:tblStyle w:val="TableGrid"/>
+        <w:tblW w:type="auto" w:w="0"/>
+        <w:jc w:val="center"/>
+        <w:tblLook w:firstColumn="1" w:firstRow="1" w:lastColumn="0" w:lastRow="0" w:noHBand="0" w:noVBand="1" w:val="04A0"/>
+      </w:tblPr>
+      <w:tblGrid>
+        <w:gridCol w:w="9689"/>
+      </w:tblGrid>
+      <w:tr>
+        <w:tc>
+          <w:tcPr>
+            <w:tcW w:type="dxa" w:w="9689"/>
+            <w:vAlign w:val="center"/>
+          </w:tcPr>
+          <w:p>
+            <w:pPr>
+              <w:jc w:val="center"/>
+            </w:pPr>
+            <w:r>
+              <w:rPr>
+                <w:rFonts w:ascii="Times New Roman" w:hAnsi="Times New Roman" w:eastAsia="Times New Roman"/>
+                <w:b/>
+                <w:sz w:val="24"/>
+              </w:rPr>
+              <w:t>Место для скриншота</w:t>
+            </w:r>
+          </w:p>
+          <w:p/>
+          <w:p/>
+          <w:p/>
+          <w:p/>
+          <w:p/>
+          <w:p/>
+          <w:p/>
+          <w:p/>
+        </w:tc>
+      </w:tr>
+    </w:tbl>
+    <w:p>
+      <w:pPr>
+        <w:spacing w:line="360" w:lineRule="auto" w:after="120"/>
+        <w:jc w:val="center"/>
+      </w:pPr>
+      <w:r>
+        <w:rPr>
+          <w:rFonts w:ascii="Times New Roman" w:hAnsi="Times New Roman" w:eastAsia="Times New Roman"/>
+          <w:b w:val="0"/>
+          <w:sz w:val="24"/>
+        </w:rPr>
+        <w:t>Рисунок 8 — Админ-панель удаления пользователей</w:t>
+      </w:r>
+    </w:p>
+    <w:tbl>
+      <w:tblPr>
+        <w:tblStyle w:val="TableGrid"/>
+        <w:tblW w:type="auto" w:w="0"/>
+        <w:jc w:val="center"/>
+        <w:tblLook w:firstColumn="1" w:firstRow="1" w:lastColumn="0" w:lastRow="0" w:noHBand="0" w:noVBand="1" w:val="04A0"/>
+      </w:tblPr>
+      <w:tblGrid>
+        <w:gridCol w:w="9689"/>
+      </w:tblGrid>
+      <w:tr>
+        <w:tc>
+          <w:tcPr>
+            <w:tcW w:type="dxa" w:w="9689"/>
+            <w:vAlign w:val="center"/>
+          </w:tcPr>
+          <w:p>
+            <w:pPr>
+              <w:jc w:val="center"/>
+            </w:pPr>
+            <w:r>
+              <w:rPr>
+                <w:rFonts w:ascii="Times New Roman" w:hAnsi="Times New Roman" w:eastAsia="Times New Roman"/>
+                <w:b/>
+                <w:sz w:val="24"/>
+              </w:rPr>
+              <w:t>Место для скриншота</w:t>
+            </w:r>
+          </w:p>
+          <w:p/>
+          <w:p/>
+          <w:p/>
+          <w:p/>
+          <w:p/>
+          <w:p/>
+          <w:p/>
+          <w:p/>
+        </w:tc>
+      </w:tr>
+    </w:tbl>
+    <w:p>
+      <w:pPr>
+        <w:spacing w:line="360" w:lineRule="auto" w:after="120"/>
+        <w:jc w:val="center"/>
+      </w:pPr>
+      <w:r>
+        <w:rPr>
+          <w:rFonts w:ascii="Times New Roman" w:hAnsi="Times New Roman" w:eastAsia="Times New Roman"/>
+          <w:b w:val="0"/>
+          <w:sz w:val="24"/>
+        </w:rPr>
+        <w:t>Рисунок 9 — Ответ GET /users или GET /toys</w:t>
+      </w:r>
+    </w:p>
+    <w:tbl>
+      <w:tblPr>
+        <w:tblStyle w:val="TableGrid"/>
+        <w:tblW w:type="auto" w:w="0"/>
+        <w:jc w:val="center"/>
+        <w:tblLook w:firstColumn="1" w:firstRow="1" w:lastColumn="0" w:lastRow="0" w:noHBand="0" w:noVBand="1" w:val="04A0"/>
+      </w:tblPr>
+      <w:tblGrid>
+        <w:gridCol w:w="9689"/>
+      </w:tblGrid>
+      <w:tr>
+        <w:tc>
+          <w:tcPr>
+            <w:tcW w:type="dxa" w:w="9689"/>
+            <w:vAlign w:val="center"/>
+          </w:tcPr>
+          <w:p>
+            <w:pPr>
+              <w:jc w:val="center"/>
+            </w:pPr>
+            <w:r>
+              <w:rPr>
+                <w:rFonts w:ascii="Times New Roman" w:hAnsi="Times New Roman" w:eastAsia="Times New Roman"/>
+                <w:b/>
+                <w:sz w:val="24"/>
+              </w:rPr>
+              <w:t>Место для скриншота</w:t>
+            </w:r>
+          </w:p>
+          <w:p/>
+          <w:p/>
+          <w:p/>
+          <w:p/>
+          <w:p/>
+          <w:p/>
+          <w:p/>
+          <w:p/>
+        </w:tc>
+      </w:tr>
+    </w:tbl>
+    <w:p>
+      <w:pPr>
+        <w:spacing w:line="360" w:lineRule="auto" w:after="120"/>
+        <w:jc w:val="center"/>
+      </w:pPr>
+      <w:r>
+        <w:rPr>
+          <w:rFonts w:ascii="Times New Roman" w:hAnsi="Times New Roman" w:eastAsia="Times New Roman"/>
+          <w:b w:val="0"/>
+          <w:sz w:val="24"/>
+        </w:rPr>
+        <w:t>Рисунок 10 — Логи HTTP-запросов backend</w:t>
       </w:r>
     </w:p>
     <w:p>
@@ -2008,7 +2481,7 @@
           <w:b w:val="0"/>
           <w:sz w:val="24"/>
         </w:rPr>
-        <w:t>В ходе курсовой работы разработано клиент-серверное приложение Toy Shelf. Приложение реализует обязательные endpoint для работы с пользователями, хранит данные в памяти, выполняет валидацию email и обязательных полей, обрабатывает ошибки и возвращает JSON-ответы.</w:t>
+        <w:t>В результате выполнения курсовой работы разработано клиент-серверное приложение artlo. Приложение реализует обязательные endpoint /users, хранит данные в памяти, проверяет обязательные поля, валидирует email, использует пароль при регистрации и поддерживает вход пользователя.</w:t>
       </w:r>
     </w:p>
     <w:p>
@@ -2022,7 +2495,7 @@
           <w:b w:val="0"/>
           <w:sz w:val="24"/>
         </w:rPr>
-        <w:t>Серверная часть демонстрирует изученные возможности NestJS: модули, контроллеры, сервисы, провайдеры, декораторы, DTO, ValidationPipe, фильтр исключений и middleware логирования. Клиентская часть демонстрирует HTML/JSX, CSS, Fetch API, LocalStorage, регистрацию профиля с паролем, вход пользователя, вход администратора, удаление пользователей, витрину товаров, корзину и изменение остатков после заказа.</w:t>
+        <w:t>Серверная часть демонстрирует NestJS-модули, контроллеры, сервисы, DTO, декораторы, провайдеры, ValidationPipe, class-validator, class-transformer, bcryptjs, обработку исключений и логирование запросов. Клиентская часть демонстрирует HTML/JSX, CSS, Fetch API, LocalStorage, регистрацию, вход, корзину, оформление заказа, обновление остатков и админское удаление пользователей.</w:t>
       </w:r>
     </w:p>
     <w:p>
@@ -2036,7 +2509,7 @@
           <w:b w:val="0"/>
           <w:sz w:val="24"/>
         </w:rPr>
-        <w:t>Поставленная задача выполнена в соответствии с индивидуальной постановкой: данные не сохраняются между перезапусками, API пользователей реализовано, обязательные поля проверяются, email валидируется, а приложение может быть запущено локально и проверено через браузер.</w:t>
+        <w:t>Работа приложения проверяется через браузер и HTTP-запросы. Основные сценарии: регистрация пользователя, вход пользователя, вход администратора, получение списка пользователей, удаление пользователя администратором, получение каталога товаров, добавление товара в корзину, оформление заказа и уменьшение остатка.</w:t>
       </w:r>
     </w:p>
     <w:p>
@@ -2050,7 +2523,7 @@
           <w:b w:val="0"/>
           <w:sz w:val="24"/>
         </w:rPr>
-        <w:t>Возможные направления развития проекта: перенос хранения данных из памяти в PostgreSQL, добавление серверных guards для проверки ролей, использование JWT, добавление полноценного CRUD для игрушек и автоматические тесты для контроллеров и сервисов.</w:t>
+        <w:t>Проект опубликован в GitHub-репозитории. Для запуска необходимо установить Node.js, выполнить npm.cmd install в backend и frontend, затем запустить backend через npm.cmd run start:dev и frontend через npm.cmd run dev.</w:t>
       </w:r>
     </w:p>
     <w:p>
@@ -2079,7 +2552,7 @@
           <w:b w:val="0"/>
           <w:sz w:val="24"/>
         </w:rPr>
-        <w:t>[1] Официальная документация NestJS. URL: https://docs.nestjs.com/</w:t>
+        <w:t>1. NestJS Documentation [Электронный ресурс]. URL: https://docs.nestjs.com/ (дата обращения: 07.06.2026).</w:t>
       </w:r>
     </w:p>
     <w:p>
@@ -2093,7 +2566,7 @@
           <w:b w:val="0"/>
           <w:sz w:val="24"/>
         </w:rPr>
-        <w:t>[2] Официальная документация React. URL: https://react.dev/</w:t>
+        <w:t>2. React Documentation [Электронный ресурс]. URL: https://react.dev/ (дата обращения: 07.06.2026).</w:t>
       </w:r>
     </w:p>
     <w:p>
@@ -2107,7 +2580,7 @@
           <w:b w:val="0"/>
           <w:sz w:val="24"/>
         </w:rPr>
-        <w:t>[3] Документация Vite. URL: https://vite.dev/</w:t>
+        <w:t>3. Vite Documentation [Электронный ресурс]. URL: https://vite.dev/ (дата обращения: 07.06.2026).</w:t>
       </w:r>
     </w:p>
     <w:p>
@@ -2121,7 +2594,7 @@
           <w:b w:val="0"/>
           <w:sz w:val="24"/>
         </w:rPr>
-        <w:t>[4] Документация MDN Web Docs по Fetch API. URL: https://developer.mozilla.org/docs/Web/API/Fetch_API</w:t>
+        <w:t>4. MDN Web Docs. Fetch API [Электронный ресурс]. URL: https://developer.mozilla.org/docs/Web/API/Fetch_API (дата обращения: 07.06.2026).</w:t>
       </w:r>
     </w:p>
     <w:p>
@@ -2135,7 +2608,7 @@
           <w:b w:val="0"/>
           <w:sz w:val="24"/>
         </w:rPr>
-        <w:t>[5] Документация MDN Web Docs по LocalStorage. URL: https://developer.mozilla.org/docs/Web/API/Window/localStorage</w:t>
+        <w:t>5. MDN Web Docs. Window: localStorage property [Электронный ресурс]. URL: https://developer.mozilla.org/docs/Web/API/Window/localStorage (дата обращения: 07.06.2026).</w:t>
       </w:r>
     </w:p>
     <w:p>
@@ -2149,7 +2622,7 @@
           <w:b w:val="0"/>
           <w:sz w:val="24"/>
         </w:rPr>
-        <w:t>[6] Документация class-validator. URL: https://github.com/typestack/class-validator</w:t>
+        <w:t>6. class-validator. GitHub repository [Электронный ресурс]. URL: https://github.com/typestack/class-validator (дата обращения: 07.06.2026).</w:t>
       </w:r>
     </w:p>
     <w:p>
@@ -2163,7 +2636,7 @@
           <w:b w:val="0"/>
           <w:sz w:val="24"/>
         </w:rPr>
-        <w:t>[7] Документация bcryptjs. URL: https://www.npmjs.com/package/bcryptjs</w:t>
+        <w:t>7. bcryptjs. npm package [Электронный ресурс]. URL: https://www.npmjs.com/package/bcryptjs (дата обращения: 07.06.2026).</w:t>
       </w:r>
     </w:p>
     <w:p>
@@ -2177,7 +2650,7 @@
           <w:b w:val="0"/>
           <w:sz w:val="24"/>
         </w:rPr>
-        <w:t>[8] ГОСТ 7.32-2017. Отчет о научно-исследовательской работе. Структура и правила оформления.</w:t>
+        <w:t>8. ГОСТ 7.32-2017. Отчет о научно-исследовательской работе. Структура и правила оформления. М.: Стандартинформ, 2017.</w:t>
       </w:r>
     </w:p>
     <w:p>
@@ -2191,7 +2664,7 @@
           <w:b w:val="0"/>
           <w:sz w:val="24"/>
         </w:rPr>
-        <w:t>[9] Репозиторий исходного кода приложения Toy Shelf. URL: https://github.com/Artlogg/toy-shelf-coursework</w:t>
+        <w:t>9. Репозиторий исходного кода приложения artlo [Электронный ресурс]. URL: https://github.com/Artlogg/toy-shelf-coursework (дата обращения: 07.06.2026).</w:t>
       </w:r>
     </w:p>
     <w:sectPr>
@@ -2240,7 +2713,7 @@
         <w:b w:val="0"/>
         <w:sz w:val="20"/>
       </w:rPr>
-      <w:t>Кадыров А. Р. — курсовая работа Toy Shelf</w:t>
+      <w:t>Кадыров А. Р. — курсовая работа artlo</w:t>
     </w:r>
   </w:p>
 </w:hdr>

</xml_diff>